<commit_message>
Set Hebrew project book to RTL
Co-authored-by: Cursor <cursoragent@cursor.com>
</commit_message>
<xml_diff>
--- a/secure_chat/book2/SecureChat_Project_Book_HE.docx
+++ b/secure_chat/book2/SecureChat_Project_Book_HE.docx
@@ -4,16 +4,19 @@
   <w:body>
     <w:p>
       <w:pPr>
-        <w:jc w:val="right"/>
-        <w:bidi w:val="1"/>
-      </w:pPr>
-      <w:r>
-        <w:rPr>
-          <w:rFonts w:ascii="Arial" w:hAnsi="Arial" w:cs="Arial"/>
-          <w:b w:val="0"/>
-          <w:sz w:val="24"/>
-        </w:rPr>
-        <w:t>﻿# ספר פרויקט: SecureChat</w:t>
+        <w:pStyle w:val="Title"/>
+        <w:jc w:val="right"/>
+        <w:bidi w:val="1"/>
+      </w:pPr>
+      <w:r>
+        <w:rPr>
+          <w:rFonts w:ascii="Arial" w:hAnsi="Arial" w:cs="Arial"/>
+          <w:b/>
+          <w:sz w:val="40"/>
+          <w:rtl w:val="1"/>
+          <w:lang w:bidi="he-IL"/>
+        </w:rPr>
+        <w:t>ספר פרויקט: SecureChat</w:t>
       </w:r>
     </w:p>
     <w:p/>
@@ -28,6 +31,8 @@
           <w:rFonts w:ascii="Arial" w:hAnsi="Arial" w:cs="Arial"/>
           <w:b/>
           <w:sz w:val="32"/>
+          <w:rtl w:val="1"/>
+          <w:lang w:bidi="he-IL"/>
         </w:rPr>
         <w:t>פרטי התלמיד</w:t>
       </w:r>
@@ -43,6 +48,8 @@
           <w:rFonts w:ascii="Arial" w:hAnsi="Arial" w:cs="Arial"/>
           <w:b w:val="0"/>
           <w:sz w:val="24"/>
+          <w:rtl w:val="1"/>
+          <w:lang w:bidi="he-IL"/>
         </w:rPr>
         <w:t>שם הפרויקט: SecureChat - מערכת צ'אט מאובטחת מרובת משתמשים</w:t>
       </w:r>
@@ -57,6 +64,8 @@
           <w:rFonts w:ascii="Arial" w:hAnsi="Arial" w:cs="Arial"/>
           <w:b w:val="0"/>
           <w:sz w:val="24"/>
+          <w:rtl w:val="1"/>
+          <w:lang w:bidi="he-IL"/>
         </w:rPr>
         <w:t>מקצוע: תכנון ותכנות מערכות - חלופת מערכות הגנת סייבר</w:t>
       </w:r>
@@ -71,6 +80,8 @@
           <w:rFonts w:ascii="Arial" w:hAnsi="Arial" w:cs="Arial"/>
           <w:b w:val="0"/>
           <w:sz w:val="24"/>
+          <w:rtl w:val="1"/>
+          <w:lang w:bidi="he-IL"/>
         </w:rPr>
         <w:t>רמת לימוד: 5 יחידות לימוד</w:t>
       </w:r>
@@ -85,6 +96,8 @@
           <w:rFonts w:ascii="Arial" w:hAnsi="Arial" w:cs="Arial"/>
           <w:b w:val="0"/>
           <w:sz w:val="24"/>
+          <w:rtl w:val="1"/>
+          <w:lang w:bidi="he-IL"/>
         </w:rPr>
         <w:t>שם התלמיד: ____________</w:t>
       </w:r>
@@ -99,6 +112,8 @@
           <w:rFonts w:ascii="Arial" w:hAnsi="Arial" w:cs="Arial"/>
           <w:b w:val="0"/>
           <w:sz w:val="24"/>
+          <w:rtl w:val="1"/>
+          <w:lang w:bidi="he-IL"/>
         </w:rPr>
         <w:t>תעודת זהות: ____________</w:t>
       </w:r>
@@ -113,6 +128,8 @@
           <w:rFonts w:ascii="Arial" w:hAnsi="Arial" w:cs="Arial"/>
           <w:b w:val="0"/>
           <w:sz w:val="24"/>
+          <w:rtl w:val="1"/>
+          <w:lang w:bidi="he-IL"/>
         </w:rPr>
         <w:t>שם בית הספר: ____________</w:t>
       </w:r>
@@ -127,6 +144,8 @@
           <w:rFonts w:ascii="Arial" w:hAnsi="Arial" w:cs="Arial"/>
           <w:b w:val="0"/>
           <w:sz w:val="24"/>
+          <w:rtl w:val="1"/>
+          <w:lang w:bidi="he-IL"/>
         </w:rPr>
         <w:t>סמל מוסד: ____________</w:t>
       </w:r>
@@ -141,6 +160,8 @@
           <w:rFonts w:ascii="Arial" w:hAnsi="Arial" w:cs="Arial"/>
           <w:b w:val="0"/>
           <w:sz w:val="24"/>
+          <w:rtl w:val="1"/>
+          <w:lang w:bidi="he-IL"/>
         </w:rPr>
         <w:t>שם המורה: ____________</w:t>
       </w:r>
@@ -155,6 +176,8 @@
           <w:rFonts w:ascii="Arial" w:hAnsi="Arial" w:cs="Arial"/>
           <w:b w:val="0"/>
           <w:sz w:val="24"/>
+          <w:rtl w:val="1"/>
+          <w:lang w:bidi="he-IL"/>
         </w:rPr>
         <w:t>תאריך הגשה: ____________</w:t>
       </w:r>
@@ -177,6 +200,8 @@
           <w:rFonts w:ascii="Arial" w:hAnsi="Arial" w:cs="Arial"/>
           <w:b/>
           <w:sz w:val="32"/>
+          <w:rtl w:val="1"/>
+          <w:lang w:bidi="he-IL"/>
         </w:rPr>
         <w:t>תוכן עניינים</w:t>
       </w:r>
@@ -192,6 +217,8 @@
           <w:rFonts w:ascii="Arial" w:hAnsi="Arial" w:cs="Arial"/>
           <w:b w:val="0"/>
           <w:sz w:val="24"/>
+          <w:rtl w:val="1"/>
+          <w:lang w:bidi="he-IL"/>
         </w:rPr>
         <w:t>1. מבוא וייזום הפרויקט</w:t>
       </w:r>
@@ -206,6 +233,8 @@
           <w:rFonts w:ascii="Arial" w:hAnsi="Arial" w:cs="Arial"/>
           <w:b w:val="0"/>
           <w:sz w:val="24"/>
+          <w:rtl w:val="1"/>
+          <w:lang w:bidi="he-IL"/>
         </w:rPr>
         <w:t>2. אפיון המערכת</w:t>
       </w:r>
@@ -220,6 +249,8 @@
           <w:rFonts w:ascii="Arial" w:hAnsi="Arial" w:cs="Arial"/>
           <w:b w:val="0"/>
           <w:sz w:val="24"/>
+          <w:rtl w:val="1"/>
+          <w:lang w:bidi="he-IL"/>
         </w:rPr>
         <w:t>3. לוח זמנים</w:t>
       </w:r>
@@ -234,6 +265,8 @@
           <w:rFonts w:ascii="Arial" w:hAnsi="Arial" w:cs="Arial"/>
           <w:b w:val="0"/>
           <w:sz w:val="24"/>
+          <w:rtl w:val="1"/>
+          <w:lang w:bidi="he-IL"/>
         </w:rPr>
         <w:t>4. ניהול סיכונים</w:t>
       </w:r>
@@ -248,6 +281,8 @@
           <w:rFonts w:ascii="Arial" w:hAnsi="Arial" w:cs="Arial"/>
           <w:b w:val="0"/>
           <w:sz w:val="24"/>
+          <w:rtl w:val="1"/>
+          <w:lang w:bidi="he-IL"/>
         </w:rPr>
         <w:t>5. תיאור תחום הידע</w:t>
       </w:r>
@@ -262,6 +297,8 @@
           <w:rFonts w:ascii="Arial" w:hAnsi="Arial" w:cs="Arial"/>
           <w:b w:val="0"/>
           <w:sz w:val="24"/>
+          <w:rtl w:val="1"/>
+          <w:lang w:bidi="he-IL"/>
         </w:rPr>
         <w:t>6. ארכיטקטורת המערכת</w:t>
       </w:r>
@@ -276,6 +313,8 @@
           <w:rFonts w:ascii="Arial" w:hAnsi="Arial" w:cs="Arial"/>
           <w:b w:val="0"/>
           <w:sz w:val="24"/>
+          <w:rtl w:val="1"/>
+          <w:lang w:bidi="he-IL"/>
         </w:rPr>
         <w:t>7. חלוקה למודולים</w:t>
       </w:r>
@@ -290,6 +329,8 @@
           <w:rFonts w:ascii="Arial" w:hAnsi="Arial" w:cs="Arial"/>
           <w:b w:val="0"/>
           <w:sz w:val="24"/>
+          <w:rtl w:val="1"/>
+          <w:lang w:bidi="he-IL"/>
         </w:rPr>
         <w:t>8. פרוטוקול התקשורת</w:t>
       </w:r>
@@ -304,6 +345,8 @@
           <w:rFonts w:ascii="Arial" w:hAnsi="Arial" w:cs="Arial"/>
           <w:b w:val="0"/>
           <w:sz w:val="24"/>
+          <w:rtl w:val="1"/>
+          <w:lang w:bidi="he-IL"/>
         </w:rPr>
         <w:t>9. אלגוריתמים מרכזיים</w:t>
       </w:r>
@@ -318,6 +361,8 @@
           <w:rFonts w:ascii="Arial" w:hAnsi="Arial" w:cs="Arial"/>
           <w:b w:val="0"/>
           <w:sz w:val="24"/>
+          <w:rtl w:val="1"/>
+          <w:lang w:bidi="he-IL"/>
         </w:rPr>
         <w:t>10. אבטחת מידע וחולשות</w:t>
       </w:r>
@@ -332,6 +377,8 @@
           <w:rFonts w:ascii="Arial" w:hAnsi="Arial" w:cs="Arial"/>
           <w:b w:val="0"/>
           <w:sz w:val="24"/>
+          <w:rtl w:val="1"/>
+          <w:lang w:bidi="he-IL"/>
         </w:rPr>
         <w:t>11. תיאור מימוש הפרויקט</w:t>
       </w:r>
@@ -346,6 +393,8 @@
           <w:rFonts w:ascii="Arial" w:hAnsi="Arial" w:cs="Arial"/>
           <w:b w:val="0"/>
           <w:sz w:val="24"/>
+          <w:rtl w:val="1"/>
+          <w:lang w:bidi="he-IL"/>
         </w:rPr>
         <w:t>12. תכנות מונחה עצמים</w:t>
       </w:r>
@@ -360,6 +409,8 @@
           <w:rFonts w:ascii="Arial" w:hAnsi="Arial" w:cs="Arial"/>
           <w:b w:val="0"/>
           <w:sz w:val="24"/>
+          <w:rtl w:val="1"/>
+          <w:lang w:bidi="he-IL"/>
         </w:rPr>
         <w:t>13. שמירת נתונים וקבצים</w:t>
       </w:r>
@@ -374,6 +425,8 @@
           <w:rFonts w:ascii="Arial" w:hAnsi="Arial" w:cs="Arial"/>
           <w:b w:val="0"/>
           <w:sz w:val="24"/>
+          <w:rtl w:val="1"/>
+          <w:lang w:bidi="he-IL"/>
         </w:rPr>
         <w:t>14. בדיקות</w:t>
       </w:r>
@@ -388,6 +441,8 @@
           <w:rFonts w:ascii="Arial" w:hAnsi="Arial" w:cs="Arial"/>
           <w:b w:val="0"/>
           <w:sz w:val="24"/>
+          <w:rtl w:val="1"/>
+          <w:lang w:bidi="he-IL"/>
         </w:rPr>
         <w:t>15. מדריך למשתמש</w:t>
       </w:r>
@@ -402,6 +457,8 @@
           <w:rFonts w:ascii="Arial" w:hAnsi="Arial" w:cs="Arial"/>
           <w:b w:val="0"/>
           <w:sz w:val="24"/>
+          <w:rtl w:val="1"/>
+          <w:lang w:bidi="he-IL"/>
         </w:rPr>
         <w:t>16. סיכום אישי ורפלקציה</w:t>
       </w:r>
@@ -416,6 +473,8 @@
           <w:rFonts w:ascii="Arial" w:hAnsi="Arial" w:cs="Arial"/>
           <w:b w:val="0"/>
           <w:sz w:val="24"/>
+          <w:rtl w:val="1"/>
+          <w:lang w:bidi="he-IL"/>
         </w:rPr>
         <w:t>17. ביבליוגרפיה</w:t>
       </w:r>
@@ -430,6 +489,8 @@
           <w:rFonts w:ascii="Arial" w:hAnsi="Arial" w:cs="Arial"/>
           <w:b w:val="0"/>
           <w:sz w:val="24"/>
+          <w:rtl w:val="1"/>
+          <w:lang w:bidi="he-IL"/>
         </w:rPr>
         <w:t>18. נספחים</w:t>
       </w:r>
@@ -452,6 +513,8 @@
           <w:rFonts w:ascii="Arial" w:hAnsi="Arial" w:cs="Arial"/>
           <w:b/>
           <w:sz w:val="32"/>
+          <w:rtl w:val="1"/>
+          <w:lang w:bidi="he-IL"/>
         </w:rPr>
         <w:t>1. מבוא וייזום הפרויקט</w:t>
       </w:r>
@@ -467,6 +530,8 @@
           <w:rFonts w:ascii="Arial" w:hAnsi="Arial" w:cs="Arial"/>
           <w:b w:val="0"/>
           <w:sz w:val="24"/>
+          <w:rtl w:val="1"/>
+          <w:lang w:bidi="he-IL"/>
         </w:rPr>
         <w:t>הפרויקט SecureChat הוא מערכת צ'אט מאובטחת המאפשרת למספר משתמשים להתחבר לשרת מרכזי, להירשם, להתחבר, להצטרף לחדרים, ליצור חדרים חדשים, לשלוח הודעות טקסט, אימוג'ים, תמונות, קבצים וסרטונים, ולנהל פעולות מתקדמות כמו הודעות פרטיות, פרופיל משתמש, חיפוש הודעות, חברים, גלריית תמונות, פאנל מנהל בסיסי וקודי 2FA להדגמה.</w:t>
       </w:r>
@@ -482,6 +547,8 @@
           <w:rFonts w:ascii="Arial" w:hAnsi="Arial" w:cs="Arial"/>
           <w:b w:val="0"/>
           <w:sz w:val="24"/>
+          <w:rtl w:val="1"/>
+          <w:lang w:bidi="he-IL"/>
         </w:rPr>
         <w:t>המערכת נבנתה כפרויקט רשתות וסייבר ולכן היא מדגישה תקשורת בין לקוח לשרת, שימוש בסוקטים, תהליכונים, הצפנה, שמירת נתונים, ממשק משתמש גרפי וניתוח חולשות אבטחה.</w:t>
       </w:r>
@@ -498,6 +565,8 @@
           <w:rFonts w:ascii="Arial" w:hAnsi="Arial" w:cs="Arial"/>
           <w:b/>
           <w:sz w:val="28"/>
+          <w:rtl w:val="1"/>
+          <w:lang w:bidi="he-IL"/>
         </w:rPr>
         <w:t>מטרת הפרויקט</w:t>
       </w:r>
@@ -513,6 +582,8 @@
           <w:rFonts w:ascii="Arial" w:hAnsi="Arial" w:cs="Arial"/>
           <w:b w:val="0"/>
           <w:sz w:val="24"/>
+          <w:rtl w:val="1"/>
+          <w:lang w:bidi="he-IL"/>
         </w:rPr>
         <w:t>מטרת הפרויקט היא לפתח מערכת תקשורת אמיתית המדמה שירות צ'אט מודרני, תוך שימוש בעקרונות שנלמדו ברשתות, מערכות הפעלה ואבטחת מידע. המערכת צריכה להראות יכולת העברת מידע מקצה לקצה בין כמה לקוחות במקביל, בצורה מוצפנת ובטוחה יותר ממימוש בסיסי.</w:t>
       </w:r>
@@ -529,6 +600,8 @@
           <w:rFonts w:ascii="Arial" w:hAnsi="Arial" w:cs="Arial"/>
           <w:b/>
           <w:sz w:val="28"/>
+          <w:rtl w:val="1"/>
+          <w:lang w:bidi="he-IL"/>
         </w:rPr>
         <w:t>הצורך במערכת</w:t>
       </w:r>
@@ -544,6 +617,8 @@
           <w:rFonts w:ascii="Arial" w:hAnsi="Arial" w:cs="Arial"/>
           <w:b w:val="0"/>
           <w:sz w:val="24"/>
+          <w:rtl w:val="1"/>
+          <w:lang w:bidi="he-IL"/>
         </w:rPr>
         <w:t>במערכות צ'אט רגילות מועבר מידע אישי בין משתמשים. מידע כזה יכול לכלול הודעות פרטיות, קבצים, תמונות וסרטונים. לכן חשוב להגן על המידע בזמן מעבר ברשת, למנוע גישה לא מורשית, למנוע קריסות של השרת ולשמור נתונים בצורה מסודרת.</w:t>
       </w:r>
@@ -560,6 +635,8 @@
           <w:rFonts w:ascii="Arial" w:hAnsi="Arial" w:cs="Arial"/>
           <w:b/>
           <w:sz w:val="28"/>
+          <w:rtl w:val="1"/>
+          <w:lang w:bidi="he-IL"/>
         </w:rPr>
         <w:t>קהל יעד</w:t>
       </w:r>
@@ -575,6 +652,8 @@
           <w:rFonts w:ascii="Arial" w:hAnsi="Arial" w:cs="Arial"/>
           <w:b w:val="0"/>
           <w:sz w:val="24"/>
+          <w:rtl w:val="1"/>
+          <w:lang w:bidi="he-IL"/>
         </w:rPr>
         <w:t>המערכת מיועדת לקבוצת משתמשים קטנה או בינונית, לדוגמה תלמידי כיתה, צוות עבודה או קבוצת חברים שרוצים לתקשר בתוך רשת מקומית או סביבת הדגמה.</w:t>
       </w:r>
@@ -591,6 +670,8 @@
           <w:rFonts w:ascii="Arial" w:hAnsi="Arial" w:cs="Arial"/>
           <w:b/>
           <w:sz w:val="28"/>
+          <w:rtl w:val="1"/>
+          <w:lang w:bidi="he-IL"/>
         </w:rPr>
         <w:t>גבולות הפרויקט</w:t>
       </w:r>
@@ -606,6 +687,8 @@
           <w:rFonts w:ascii="Arial" w:hAnsi="Arial" w:cs="Arial"/>
           <w:b w:val="0"/>
           <w:sz w:val="24"/>
+          <w:rtl w:val="1"/>
+          <w:lang w:bidi="he-IL"/>
         </w:rPr>
         <w:t>הפרויקט אינו מוצר מסחרי מלא. הוא מיועד להדגמת יכולות תכנות, רשתות וסייבר. לכן חלק מהיכולות הן גרסאות לימודיות, לדוגמה קוד 2FA שמוצג בתוך המערכת ולא נשלח באמת לטלפון.</w:t>
       </w:r>
@@ -628,6 +711,8 @@
           <w:rFonts w:ascii="Arial" w:hAnsi="Arial" w:cs="Arial"/>
           <w:b/>
           <w:sz w:val="32"/>
+          <w:rtl w:val="1"/>
+          <w:lang w:bidi="he-IL"/>
         </w:rPr>
         <w:t>2. אפיון המערכת</w:t>
       </w:r>
@@ -644,6 +729,8 @@
           <w:rFonts w:ascii="Arial" w:hAnsi="Arial" w:cs="Arial"/>
           <w:b/>
           <w:sz w:val="28"/>
+          <w:rtl w:val="1"/>
+          <w:lang w:bidi="he-IL"/>
         </w:rPr>
         <w:t>משתמשים במערכת</w:t>
       </w:r>
@@ -659,6 +746,8 @@
           <w:rFonts w:ascii="Arial" w:hAnsi="Arial" w:cs="Arial"/>
           <w:b w:val="0"/>
           <w:sz w:val="24"/>
+          <w:rtl w:val="1"/>
+          <w:lang w:bidi="he-IL"/>
         </w:rPr>
         <w:t>1. משתמש רגיל</w:t>
       </w:r>
@@ -673,6 +762,8 @@
           <w:rFonts w:ascii="Arial" w:hAnsi="Arial" w:cs="Arial"/>
           <w:b w:val="0"/>
           <w:sz w:val="24"/>
+          <w:rtl w:val="1"/>
+          <w:lang w:bidi="he-IL"/>
         </w:rPr>
         <w:t xml:space="preserve">   יכול להירשם, להתחבר, לשלוח הודעות, להצטרף לחדרים, ליצור חדרים, לשלוח קבצים, להשתמש בפקודות מתקדמות ולראות משתמשים מחוברים.</w:t>
       </w:r>
@@ -688,6 +779,8 @@
           <w:rFonts w:ascii="Arial" w:hAnsi="Arial" w:cs="Arial"/>
           <w:b w:val="0"/>
           <w:sz w:val="24"/>
+          <w:rtl w:val="1"/>
+          <w:lang w:bidi="he-IL"/>
         </w:rPr>
         <w:t>2. מנהל מערכת</w:t>
       </w:r>
@@ -702,6 +795,8 @@
           <w:rFonts w:ascii="Arial" w:hAnsi="Arial" w:cs="Arial"/>
           <w:b w:val="0"/>
           <w:sz w:val="24"/>
+          <w:rtl w:val="1"/>
+          <w:lang w:bidi="he-IL"/>
         </w:rPr>
         <w:t xml:space="preserve">   המשתמש הראשון שנרשם למערכת מוגדר כמנהל. בנוסף, משתמש בשם admin מוגדר כמנהל. מנהל יכול לצפות בלוגים בסיסיים ולבעוט משתמש מחובר באמצעות פקודת מנהל.</w:t>
       </w:r>
@@ -718,6 +813,8 @@
           <w:rFonts w:ascii="Arial" w:hAnsi="Arial" w:cs="Arial"/>
           <w:b/>
           <w:sz w:val="28"/>
+          <w:rtl w:val="1"/>
+          <w:lang w:bidi="he-IL"/>
         </w:rPr>
         <w:t>יכולות מרכזיות</w:t>
       </w:r>
@@ -733,6 +830,8 @@
           <w:rFonts w:ascii="Arial" w:hAnsi="Arial" w:cs="Arial"/>
           <w:b w:val="0"/>
           <w:sz w:val="24"/>
+          <w:rtl w:val="1"/>
+          <w:lang w:bidi="he-IL"/>
         </w:rPr>
         <w:t>1. הרשמה והתחברות עם שם משתמש וסיסמה.</w:t>
       </w:r>
@@ -747,6 +846,8 @@
           <w:rFonts w:ascii="Arial" w:hAnsi="Arial" w:cs="Arial"/>
           <w:b w:val="0"/>
           <w:sz w:val="24"/>
+          <w:rtl w:val="1"/>
+          <w:lang w:bidi="he-IL"/>
         </w:rPr>
         <w:t>2. שמירת סיסמאות כ-hash עם salt ולא כטקסט גלוי.</w:t>
       </w:r>
@@ -761,6 +862,8 @@
           <w:rFonts w:ascii="Arial" w:hAnsi="Arial" w:cs="Arial"/>
           <w:b w:val="0"/>
           <w:sz w:val="24"/>
+          <w:rtl w:val="1"/>
+          <w:lang w:bidi="he-IL"/>
         </w:rPr>
         <w:t>3. תקשורת מוצפנת בין לקוח לשרת באמצעות TLS.</w:t>
       </w:r>
@@ -775,6 +878,8 @@
           <w:rFonts w:ascii="Arial" w:hAnsi="Arial" w:cs="Arial"/>
           <w:b w:val="0"/>
           <w:sz w:val="24"/>
+          <w:rtl w:val="1"/>
+          <w:lang w:bidi="he-IL"/>
         </w:rPr>
         <w:t>4. שרת מרובה לקוחות המבוסס על Thread לכל לקוח.</w:t>
       </w:r>
@@ -789,6 +894,8 @@
           <w:rFonts w:ascii="Arial" w:hAnsi="Arial" w:cs="Arial"/>
           <w:b w:val="0"/>
           <w:sz w:val="24"/>
+          <w:rtl w:val="1"/>
+          <w:lang w:bidi="he-IL"/>
         </w:rPr>
         <w:t>5. פרוטוקול הודעות עצמאי המבוסס על JSON עם כותרת אורך.</w:t>
       </w:r>
@@ -803,6 +910,8 @@
           <w:rFonts w:ascii="Arial" w:hAnsi="Arial" w:cs="Arial"/>
           <w:b w:val="0"/>
           <w:sz w:val="24"/>
+          <w:rtl w:val="1"/>
+          <w:lang w:bidi="he-IL"/>
         </w:rPr>
         <w:t>6. חדרי צ'אט, כולל יצירת חדרים חדשים.</w:t>
       </w:r>
@@ -817,6 +926,8 @@
           <w:rFonts w:ascii="Arial" w:hAnsi="Arial" w:cs="Arial"/>
           <w:b w:val="0"/>
           <w:sz w:val="24"/>
+          <w:rtl w:val="1"/>
+          <w:lang w:bidi="he-IL"/>
         </w:rPr>
         <w:t>7. חדרים עם סיסמה בפורמט room:password.</w:t>
       </w:r>
@@ -831,6 +942,8 @@
           <w:rFonts w:ascii="Arial" w:hAnsi="Arial" w:cs="Arial"/>
           <w:b w:val="0"/>
           <w:sz w:val="24"/>
+          <w:rtl w:val="1"/>
+          <w:lang w:bidi="he-IL"/>
         </w:rPr>
         <w:t>8. שליחת הודעות טקסט ואימוג'ים.</w:t>
       </w:r>
@@ -845,6 +958,8 @@
           <w:rFonts w:ascii="Arial" w:hAnsi="Arial" w:cs="Arial"/>
           <w:b w:val="0"/>
           <w:sz w:val="24"/>
+          <w:rtl w:val="1"/>
+          <w:lang w:bidi="he-IL"/>
         </w:rPr>
         <w:t>9. שליחת קבצים, תמונות וסרטונים.</w:t>
       </w:r>
@@ -859,6 +974,8 @@
           <w:rFonts w:ascii="Arial" w:hAnsi="Arial" w:cs="Arial"/>
           <w:b w:val="0"/>
           <w:sz w:val="24"/>
+          <w:rtl w:val="1"/>
+          <w:lang w:bidi="he-IL"/>
         </w:rPr>
         <w:t>10. הצגת תמונות ישירות במסך הצ'אט.</w:t>
       </w:r>
@@ -873,6 +990,8 @@
           <w:rFonts w:ascii="Arial" w:hAnsi="Arial" w:cs="Arial"/>
           <w:b w:val="0"/>
           <w:sz w:val="24"/>
+          <w:rtl w:val="1"/>
+          <w:lang w:bidi="he-IL"/>
         </w:rPr>
         <w:t>11. קישורים לחיצים לפתיחת קבצים וסרטונים.</w:t>
       </w:r>
@@ -887,6 +1006,8 @@
           <w:rFonts w:ascii="Arial" w:hAnsi="Arial" w:cs="Arial"/>
           <w:b w:val="0"/>
           <w:sz w:val="24"/>
+          <w:rtl w:val="1"/>
+          <w:lang w:bidi="he-IL"/>
         </w:rPr>
         <w:t>12. הודעות פרטיות באמצעות /dm.</w:t>
       </w:r>
@@ -901,6 +1022,8 @@
           <w:rFonts w:ascii="Arial" w:hAnsi="Arial" w:cs="Arial"/>
           <w:b w:val="0"/>
           <w:sz w:val="24"/>
+          <w:rtl w:val="1"/>
+          <w:lang w:bidi="he-IL"/>
         </w:rPr>
         <w:t>13. פרופיל משתמש באמצעות /profile.</w:t>
       </w:r>
@@ -915,6 +1038,8 @@
           <w:rFonts w:ascii="Arial" w:hAnsi="Arial" w:cs="Arial"/>
           <w:b w:val="0"/>
           <w:sz w:val="24"/>
+          <w:rtl w:val="1"/>
+          <w:lang w:bidi="he-IL"/>
         </w:rPr>
         <w:t>14. חיפוש הודעות באמצעות /search.</w:t>
       </w:r>
@@ -929,6 +1054,8 @@
           <w:rFonts w:ascii="Arial" w:hAnsi="Arial" w:cs="Arial"/>
           <w:b w:val="0"/>
           <w:sz w:val="24"/>
+          <w:rtl w:val="1"/>
+          <w:lang w:bidi="he-IL"/>
         </w:rPr>
         <w:t>15. חיווי הקלדה.</w:t>
       </w:r>
@@ -943,6 +1070,8 @@
           <w:rFonts w:ascii="Arial" w:hAnsi="Arial" w:cs="Arial"/>
           <w:b w:val="0"/>
           <w:sz w:val="24"/>
+          <w:rtl w:val="1"/>
+          <w:lang w:bidi="he-IL"/>
         </w:rPr>
         <w:t>16. אישורי קריאה כהודעות מערכת.</w:t>
       </w:r>
@@ -957,6 +1086,8 @@
           <w:rFonts w:ascii="Arial" w:hAnsi="Arial" w:cs="Arial"/>
           <w:b w:val="0"/>
           <w:sz w:val="24"/>
+          <w:rtl w:val="1"/>
+          <w:lang w:bidi="he-IL"/>
         </w:rPr>
         <w:t>17. בקשות חברות ורשימת חברים.</w:t>
       </w:r>
@@ -971,6 +1102,8 @@
           <w:rFonts w:ascii="Arial" w:hAnsi="Arial" w:cs="Arial"/>
           <w:b w:val="0"/>
           <w:sz w:val="24"/>
+          <w:rtl w:val="1"/>
+          <w:lang w:bidi="he-IL"/>
         </w:rPr>
         <w:t>18. גלריית תמונות לחדר.</w:t>
       </w:r>
@@ -985,6 +1118,8 @@
           <w:rFonts w:ascii="Arial" w:hAnsi="Arial" w:cs="Arial"/>
           <w:b w:val="0"/>
           <w:sz w:val="24"/>
+          <w:rtl w:val="1"/>
+          <w:lang w:bidi="he-IL"/>
         </w:rPr>
         <w:t>19. עריכה ומחיקה של הודעות לפי מזהה.</w:t>
       </w:r>
@@ -999,6 +1134,8 @@
           <w:rFonts w:ascii="Arial" w:hAnsi="Arial" w:cs="Arial"/>
           <w:b w:val="0"/>
           <w:sz w:val="24"/>
+          <w:rtl w:val="1"/>
+          <w:lang w:bidi="he-IL"/>
         </w:rPr>
         <w:t>20. פאנל אבטחה בסיסי דרך /admin logs.</w:t>
       </w:r>
@@ -1013,6 +1150,8 @@
           <w:rFonts w:ascii="Arial" w:hAnsi="Arial" w:cs="Arial"/>
           <w:b w:val="0"/>
           <w:sz w:val="24"/>
+          <w:rtl w:val="1"/>
+          <w:lang w:bidi="he-IL"/>
         </w:rPr>
         <w:t>21. קוד 2FA לימודי דרך /2fa.</w:t>
       </w:r>
@@ -1029,6 +1168,8 @@
           <w:rFonts w:ascii="Arial" w:hAnsi="Arial" w:cs="Arial"/>
           <w:b/>
           <w:sz w:val="28"/>
+          <w:rtl w:val="1"/>
+          <w:lang w:bidi="he-IL"/>
         </w:rPr>
         <w:t>דרישות פונקציונליות</w:t>
       </w:r>
@@ -1044,6 +1185,8 @@
           <w:rFonts w:ascii="Arial" w:hAnsi="Arial" w:cs="Arial"/>
           <w:b w:val="0"/>
           <w:sz w:val="24"/>
+          <w:rtl w:val="1"/>
+          <w:lang w:bidi="he-IL"/>
         </w:rPr>
         <w:t>1. המערכת תאפשר למשתמש חדש להירשם.</w:t>
       </w:r>
@@ -1058,6 +1201,8 @@
           <w:rFonts w:ascii="Arial" w:hAnsi="Arial" w:cs="Arial"/>
           <w:b w:val="0"/>
           <w:sz w:val="24"/>
+          <w:rtl w:val="1"/>
+          <w:lang w:bidi="he-IL"/>
         </w:rPr>
         <w:t>2. המערכת תאפשר למשתמש קיים להתחבר.</w:t>
       </w:r>
@@ -1072,6 +1217,8 @@
           <w:rFonts w:ascii="Arial" w:hAnsi="Arial" w:cs="Arial"/>
           <w:b w:val="0"/>
           <w:sz w:val="24"/>
+          <w:rtl w:val="1"/>
+          <w:lang w:bidi="he-IL"/>
         </w:rPr>
         <w:t>3. המערכת תציג הודעת הצלחה או כישלון בעת הרשמה והתחברות.</w:t>
       </w:r>
@@ -1086,6 +1233,8 @@
           <w:rFonts w:ascii="Arial" w:hAnsi="Arial" w:cs="Arial"/>
           <w:b w:val="0"/>
           <w:sz w:val="24"/>
+          <w:rtl w:val="1"/>
+          <w:lang w:bidi="he-IL"/>
         </w:rPr>
         <w:t>4. רק משתמש מחובר יוכל להיכנס למסך הצ'אט.</w:t>
       </w:r>
@@ -1100,6 +1249,8 @@
           <w:rFonts w:ascii="Arial" w:hAnsi="Arial" w:cs="Arial"/>
           <w:b w:val="0"/>
           <w:sz w:val="24"/>
+          <w:rtl w:val="1"/>
+          <w:lang w:bidi="he-IL"/>
         </w:rPr>
         <w:t>5. השרת יוכל לטפל בכמה לקוחות בו זמנית.</w:t>
       </w:r>
@@ -1114,6 +1265,8 @@
           <w:rFonts w:ascii="Arial" w:hAnsi="Arial" w:cs="Arial"/>
           <w:b w:val="0"/>
           <w:sz w:val="24"/>
+          <w:rtl w:val="1"/>
+          <w:lang w:bidi="he-IL"/>
         </w:rPr>
         <w:t>6. משתמש יוכל לשלוח הודעה לכל החברים בחדר.</w:t>
       </w:r>
@@ -1128,6 +1281,8 @@
           <w:rFonts w:ascii="Arial" w:hAnsi="Arial" w:cs="Arial"/>
           <w:b w:val="0"/>
           <w:sz w:val="24"/>
+          <w:rtl w:val="1"/>
+          <w:lang w:bidi="he-IL"/>
         </w:rPr>
         <w:t>7. משתמש יוכל ליצור חדר חדש.</w:t>
       </w:r>
@@ -1142,6 +1297,8 @@
           <w:rFonts w:ascii="Arial" w:hAnsi="Arial" w:cs="Arial"/>
           <w:b w:val="0"/>
           <w:sz w:val="24"/>
+          <w:rtl w:val="1"/>
+          <w:lang w:bidi="he-IL"/>
         </w:rPr>
         <w:t>8. משתמש יוכל להצטרף לחדר קיים.</w:t>
       </w:r>
@@ -1156,6 +1313,8 @@
           <w:rFonts w:ascii="Arial" w:hAnsi="Arial" w:cs="Arial"/>
           <w:b w:val="0"/>
           <w:sz w:val="24"/>
+          <w:rtl w:val="1"/>
+          <w:lang w:bidi="he-IL"/>
         </w:rPr>
         <w:t>9. משתמש יוכל לשלוח קובץ, תמונה או סרטון.</w:t>
       </w:r>
@@ -1170,6 +1329,8 @@
           <w:rFonts w:ascii="Arial" w:hAnsi="Arial" w:cs="Arial"/>
           <w:b w:val="0"/>
           <w:sz w:val="24"/>
+          <w:rtl w:val="1"/>
+          <w:lang w:bidi="he-IL"/>
         </w:rPr>
         <w:t>10. משתמש יוכל לפתוח קובץ שהתקבל מתוך הצ'אט.</w:t>
       </w:r>
@@ -1186,6 +1347,8 @@
           <w:rFonts w:ascii="Arial" w:hAnsi="Arial" w:cs="Arial"/>
           <w:b/>
           <w:sz w:val="28"/>
+          <w:rtl w:val="1"/>
+          <w:lang w:bidi="he-IL"/>
         </w:rPr>
         <w:t>דרישות לא פונקציונליות</w:t>
       </w:r>
@@ -1201,6 +1364,8 @@
           <w:rFonts w:ascii="Arial" w:hAnsi="Arial" w:cs="Arial"/>
           <w:b w:val="0"/>
           <w:sz w:val="24"/>
+          <w:rtl w:val="1"/>
+          <w:lang w:bidi="he-IL"/>
         </w:rPr>
         <w:t>1. השרת לא יקרוס כאשר לקוח מתנתק.</w:t>
       </w:r>
@@ -1215,6 +1380,8 @@
           <w:rFonts w:ascii="Arial" w:hAnsi="Arial" w:cs="Arial"/>
           <w:b w:val="0"/>
           <w:sz w:val="24"/>
+          <w:rtl w:val="1"/>
+          <w:lang w:bidi="he-IL"/>
         </w:rPr>
         <w:t>2. השרת יבדוק קלטים בעייתיים.</w:t>
       </w:r>
@@ -1229,6 +1396,8 @@
           <w:rFonts w:ascii="Arial" w:hAnsi="Arial" w:cs="Arial"/>
           <w:b w:val="0"/>
           <w:sz w:val="24"/>
+          <w:rtl w:val="1"/>
+          <w:lang w:bidi="he-IL"/>
         </w:rPr>
         <w:t>3. המערכת תגביל גודל הודעות וקבצים.</w:t>
       </w:r>
@@ -1243,6 +1412,8 @@
           <w:rFonts w:ascii="Arial" w:hAnsi="Arial" w:cs="Arial"/>
           <w:b w:val="0"/>
           <w:sz w:val="24"/>
+          <w:rtl w:val="1"/>
+          <w:lang w:bidi="he-IL"/>
         </w:rPr>
         <w:t>4. המידע הרגיש יעבור בתקשורת מוצפנת.</w:t>
       </w:r>
@@ -1257,6 +1428,8 @@
           <w:rFonts w:ascii="Arial" w:hAnsi="Arial" w:cs="Arial"/>
           <w:b w:val="0"/>
           <w:sz w:val="24"/>
+          <w:rtl w:val="1"/>
+          <w:lang w:bidi="he-IL"/>
         </w:rPr>
         <w:t>5. הקוד יחולק למחלקות וקבצים בצורה ברורה.</w:t>
       </w:r>
@@ -1271,6 +1444,8 @@
           <w:rFonts w:ascii="Arial" w:hAnsi="Arial" w:cs="Arial"/>
           <w:b w:val="0"/>
           <w:sz w:val="24"/>
+          <w:rtl w:val="1"/>
+          <w:lang w:bidi="he-IL"/>
         </w:rPr>
         <w:t>6. הממשק יהיה אינטראקטיבי ונוח להדגמה.</w:t>
       </w:r>
@@ -1293,6 +1468,8 @@
           <w:rFonts w:ascii="Arial" w:hAnsi="Arial" w:cs="Arial"/>
           <w:b/>
           <w:sz w:val="32"/>
+          <w:rtl w:val="1"/>
+          <w:lang w:bidi="he-IL"/>
         </w:rPr>
         <w:t>3. לוח זמנים</w:t>
       </w:r>
@@ -1308,6 +1485,8 @@
           <w:rFonts w:ascii="Arial" w:hAnsi="Arial" w:cs="Arial"/>
           <w:b w:val="0"/>
           <w:sz w:val="24"/>
+          <w:rtl w:val="1"/>
+          <w:lang w:bidi="he-IL"/>
         </w:rPr>
         <w:t>1. שלב רעיון ואפיון</w:t>
       </w:r>
@@ -1322,6 +1501,8 @@
           <w:rFonts w:ascii="Arial" w:hAnsi="Arial" w:cs="Arial"/>
           <w:b w:val="0"/>
           <w:sz w:val="24"/>
+          <w:rtl w:val="1"/>
+          <w:lang w:bidi="he-IL"/>
         </w:rPr>
         <w:t xml:space="preserve">   בחירת נושא הצ'אט המאובטח, הגדרת משתמשים, הגדרת יכולות חובה ותכנון כללי של המערכת.</w:t>
       </w:r>
@@ -1337,6 +1518,8 @@
           <w:rFonts w:ascii="Arial" w:hAnsi="Arial" w:cs="Arial"/>
           <w:b w:val="0"/>
           <w:sz w:val="24"/>
+          <w:rtl w:val="1"/>
+          <w:lang w:bidi="he-IL"/>
         </w:rPr>
         <w:t>2. שלב תכנון ארכיטקטורה</w:t>
       </w:r>
@@ -1351,6 +1534,8 @@
           <w:rFonts w:ascii="Arial" w:hAnsi="Arial" w:cs="Arial"/>
           <w:b w:val="0"/>
           <w:sz w:val="24"/>
+          <w:rtl w:val="1"/>
+          <w:lang w:bidi="he-IL"/>
         </w:rPr>
         <w:t xml:space="preserve">   החלטה על שרת מרכזי, לקוחות גרפיים, בסיס נתונים SQLite, פרוטוקול JSON והצפנת TLS.</w:t>
       </w:r>
@@ -1366,6 +1551,8 @@
           <w:rFonts w:ascii="Arial" w:hAnsi="Arial" w:cs="Arial"/>
           <w:b w:val="0"/>
           <w:sz w:val="24"/>
+          <w:rtl w:val="1"/>
+          <w:lang w:bidi="he-IL"/>
         </w:rPr>
         <w:t>3. שלב מימוש בסיסי</w:t>
       </w:r>
@@ -1380,6 +1567,8 @@
           <w:rFonts w:ascii="Arial" w:hAnsi="Arial" w:cs="Arial"/>
           <w:b w:val="0"/>
           <w:sz w:val="24"/>
+          <w:rtl w:val="1"/>
+          <w:lang w:bidi="he-IL"/>
         </w:rPr>
         <w:t xml:space="preserve">   בניית שרת סוקטים, לקוח Tkinter, הרשמה, התחברות ושליחת הודעות.</w:t>
       </w:r>
@@ -1395,6 +1584,8 @@
           <w:rFonts w:ascii="Arial" w:hAnsi="Arial" w:cs="Arial"/>
           <w:b w:val="0"/>
           <w:sz w:val="24"/>
+          <w:rtl w:val="1"/>
+          <w:lang w:bidi="he-IL"/>
         </w:rPr>
         <w:t>4. שלב אבטחה</w:t>
       </w:r>
@@ -1409,6 +1600,8 @@
           <w:rFonts w:ascii="Arial" w:hAnsi="Arial" w:cs="Arial"/>
           <w:b w:val="0"/>
           <w:sz w:val="24"/>
+          <w:rtl w:val="1"/>
+          <w:lang w:bidi="he-IL"/>
         </w:rPr>
         <w:t xml:space="preserve">   הוספת TLS, hashing לסיסמאות, בדיקות קלט והגבלות גודל.</w:t>
       </w:r>
@@ -1424,6 +1617,8 @@
           <w:rFonts w:ascii="Arial" w:hAnsi="Arial" w:cs="Arial"/>
           <w:b w:val="0"/>
           <w:sz w:val="24"/>
+          <w:rtl w:val="1"/>
+          <w:lang w:bidi="he-IL"/>
         </w:rPr>
         <w:t>5. שלב יכולות מתקדמות</w:t>
       </w:r>
@@ -1438,6 +1633,8 @@
           <w:rFonts w:ascii="Arial" w:hAnsi="Arial" w:cs="Arial"/>
           <w:b w:val="0"/>
           <w:sz w:val="24"/>
+          <w:rtl w:val="1"/>
+          <w:lang w:bidi="he-IL"/>
         </w:rPr>
         <w:t xml:space="preserve">   הוספת חדרים, קבצים, תמונות, סרטונים, הודעות פרטיות, חיפוש, חברים ופאנל מנהל.</w:t>
       </w:r>
@@ -1453,6 +1650,8 @@
           <w:rFonts w:ascii="Arial" w:hAnsi="Arial" w:cs="Arial"/>
           <w:b w:val="0"/>
           <w:sz w:val="24"/>
+          <w:rtl w:val="1"/>
+          <w:lang w:bidi="he-IL"/>
         </w:rPr>
         <w:t>6. שלב בדיקות</w:t>
       </w:r>
@@ -1467,6 +1666,8 @@
           <w:rFonts w:ascii="Arial" w:hAnsi="Arial" w:cs="Arial"/>
           <w:b w:val="0"/>
           <w:sz w:val="24"/>
+          <w:rtl w:val="1"/>
+          <w:lang w:bidi="he-IL"/>
         </w:rPr>
         <w:t xml:space="preserve">   הרצת כמה לקוחות במקביל, בדיקת הרשמה, התחברות, הודעות, קבצים וחדרים.</w:t>
       </w:r>
@@ -1482,6 +1683,8 @@
           <w:rFonts w:ascii="Arial" w:hAnsi="Arial" w:cs="Arial"/>
           <w:b w:val="0"/>
           <w:sz w:val="24"/>
+          <w:rtl w:val="1"/>
+          <w:lang w:bidi="he-IL"/>
         </w:rPr>
         <w:t>7. שלב תיעוד</w:t>
       </w:r>
@@ -1496,6 +1699,8 @@
           <w:rFonts w:ascii="Arial" w:hAnsi="Arial" w:cs="Arial"/>
           <w:b w:val="0"/>
           <w:sz w:val="24"/>
+          <w:rtl w:val="1"/>
+          <w:lang w:bidi="he-IL"/>
         </w:rPr>
         <w:t xml:space="preserve">   כתיבת ספר הפרויקט, מדריך משתמש, בדיקות וסיכום אישי.</w:t>
       </w:r>
@@ -1518,6 +1723,8 @@
           <w:rFonts w:ascii="Arial" w:hAnsi="Arial" w:cs="Arial"/>
           <w:b/>
           <w:sz w:val="32"/>
+          <w:rtl w:val="1"/>
+          <w:lang w:bidi="he-IL"/>
         </w:rPr>
         <w:t>4. ניהול סיכונים</w:t>
       </w:r>
@@ -1533,6 +1740,8 @@
           <w:rFonts w:ascii="Arial" w:hAnsi="Arial" w:cs="Arial"/>
           <w:b w:val="0"/>
           <w:sz w:val="24"/>
+          <w:rtl w:val="1"/>
+          <w:lang w:bidi="he-IL"/>
         </w:rPr>
         <w:t>1. סיכון: השרת קורס כאשר לקוח מתנתק בפתאומיות.</w:t>
       </w:r>
@@ -1547,6 +1756,8 @@
           <w:rFonts w:ascii="Arial" w:hAnsi="Arial" w:cs="Arial"/>
           <w:b w:val="0"/>
           <w:sz w:val="24"/>
+          <w:rtl w:val="1"/>
+          <w:lang w:bidi="he-IL"/>
         </w:rPr>
         <w:t xml:space="preserve">   פתרון: שימוש ב-try/except וסגירת חיבור בצורה מבוקרת.</w:t>
       </w:r>
@@ -1562,6 +1773,8 @@
           <w:rFonts w:ascii="Arial" w:hAnsi="Arial" w:cs="Arial"/>
           <w:b w:val="0"/>
           <w:sz w:val="24"/>
+          <w:rtl w:val="1"/>
+          <w:lang w:bidi="he-IL"/>
         </w:rPr>
         <w:t>2. סיכון: משתמש שולח הודעה גדולה מדי.</w:t>
       </w:r>
@@ -1576,6 +1789,8 @@
           <w:rFonts w:ascii="Arial" w:hAnsi="Arial" w:cs="Arial"/>
           <w:b w:val="0"/>
           <w:sz w:val="24"/>
+          <w:rtl w:val="1"/>
+          <w:lang w:bidi="he-IL"/>
         </w:rPr>
         <w:t xml:space="preserve">   פתרון: הגבלת גודל packet וגודל הודעה.</w:t>
       </w:r>
@@ -1591,6 +1806,8 @@
           <w:rFonts w:ascii="Arial" w:hAnsi="Arial" w:cs="Arial"/>
           <w:b w:val="0"/>
           <w:sz w:val="24"/>
+          <w:rtl w:val="1"/>
+          <w:lang w:bidi="he-IL"/>
         </w:rPr>
         <w:t>3. סיכון: משתמש שולח קובץ גדול מדי.</w:t>
       </w:r>
@@ -1605,6 +1822,8 @@
           <w:rFonts w:ascii="Arial" w:hAnsi="Arial" w:cs="Arial"/>
           <w:b w:val="0"/>
           <w:sz w:val="24"/>
+          <w:rtl w:val="1"/>
+          <w:lang w:bidi="he-IL"/>
         </w:rPr>
         <w:t xml:space="preserve">   פתרון: הגבלת גודל קובץ בקבוע MAX_FILE_SIZE.</w:t>
       </w:r>
@@ -1620,6 +1839,8 @@
           <w:rFonts w:ascii="Arial" w:hAnsi="Arial" w:cs="Arial"/>
           <w:b w:val="0"/>
           <w:sz w:val="24"/>
+          <w:rtl w:val="1"/>
+          <w:lang w:bidi="he-IL"/>
         </w:rPr>
         <w:t>4. סיכון: SQL Injection.</w:t>
       </w:r>
@@ -1634,6 +1855,8 @@
           <w:rFonts w:ascii="Arial" w:hAnsi="Arial" w:cs="Arial"/>
           <w:b w:val="0"/>
           <w:sz w:val="24"/>
+          <w:rtl w:val="1"/>
+          <w:lang w:bidi="he-IL"/>
         </w:rPr>
         <w:t xml:space="preserve">   פתרון: שימוש בשאילתות עם פרמטרים במקום חיבור מחרוזות SQL.</w:t>
       </w:r>
@@ -1649,6 +1872,8 @@
           <w:rFonts w:ascii="Arial" w:hAnsi="Arial" w:cs="Arial"/>
           <w:b w:val="0"/>
           <w:sz w:val="24"/>
+          <w:rtl w:val="1"/>
+          <w:lang w:bidi="he-IL"/>
         </w:rPr>
         <w:t>5. סיכון: שמירת סיסמאות כטקסט גלוי.</w:t>
       </w:r>
@@ -1663,6 +1888,8 @@
           <w:rFonts w:ascii="Arial" w:hAnsi="Arial" w:cs="Arial"/>
           <w:b w:val="0"/>
           <w:sz w:val="24"/>
+          <w:rtl w:val="1"/>
+          <w:lang w:bidi="he-IL"/>
         </w:rPr>
         <w:t xml:space="preserve">   פתרון: שמירת סיסמאות באמצעות PBKDF2 עם salt.</w:t>
       </w:r>
@@ -1678,6 +1905,8 @@
           <w:rFonts w:ascii="Arial" w:hAnsi="Arial" w:cs="Arial"/>
           <w:b w:val="0"/>
           <w:sz w:val="24"/>
+          <w:rtl w:val="1"/>
+          <w:lang w:bidi="he-IL"/>
         </w:rPr>
         <w:t>6. סיכון: האזנה לתעבורה ברשת.</w:t>
       </w:r>
@@ -1692,6 +1921,8 @@
           <w:rFonts w:ascii="Arial" w:hAnsi="Arial" w:cs="Arial"/>
           <w:b w:val="0"/>
           <w:sz w:val="24"/>
+          <w:rtl w:val="1"/>
+          <w:lang w:bidi="he-IL"/>
         </w:rPr>
         <w:t xml:space="preserve">   פתרון: שימוש ב-TLS להצפנת התקשורת.</w:t>
       </w:r>
@@ -1707,6 +1938,8 @@
           <w:rFonts w:ascii="Arial" w:hAnsi="Arial" w:cs="Arial"/>
           <w:b w:val="0"/>
           <w:sz w:val="24"/>
+          <w:rtl w:val="1"/>
+          <w:lang w:bidi="he-IL"/>
         </w:rPr>
         <w:t>7. סיכון: שם קובץ מסוכן עם נתיב כמו ../.</w:t>
       </w:r>
@@ -1721,6 +1954,8 @@
           <w:rFonts w:ascii="Arial" w:hAnsi="Arial" w:cs="Arial"/>
           <w:b w:val="0"/>
           <w:sz w:val="24"/>
+          <w:rtl w:val="1"/>
+          <w:lang w:bidi="he-IL"/>
         </w:rPr>
         <w:t xml:space="preserve">   פתרון: ניקוי שם הקובץ והחלפת תווי נתיב.</w:t>
       </w:r>
@@ -1736,6 +1971,8 @@
           <w:rFonts w:ascii="Arial" w:hAnsi="Arial" w:cs="Arial"/>
           <w:b w:val="0"/>
           <w:sz w:val="24"/>
+          <w:rtl w:val="1"/>
+          <w:lang w:bidi="he-IL"/>
         </w:rPr>
         <w:t>8. סיכון: עומס בגלל לקוחות מרובים.</w:t>
       </w:r>
@@ -1750,6 +1987,8 @@
           <w:rFonts w:ascii="Arial" w:hAnsi="Arial" w:cs="Arial"/>
           <w:b w:val="0"/>
           <w:sz w:val="24"/>
+          <w:rtl w:val="1"/>
+          <w:lang w:bidi="he-IL"/>
         </w:rPr>
         <w:t xml:space="preserve">   פתרון: כל לקוח מטופל בתהליכון נפרד.</w:t>
       </w:r>
@@ -1772,6 +2011,8 @@
           <w:rFonts w:ascii="Arial" w:hAnsi="Arial" w:cs="Arial"/>
           <w:b/>
           <w:sz w:val="32"/>
+          <w:rtl w:val="1"/>
+          <w:lang w:bidi="he-IL"/>
         </w:rPr>
         <w:t>5. תיאור תחום הידע</w:t>
       </w:r>
@@ -1788,6 +2029,8 @@
           <w:rFonts w:ascii="Arial" w:hAnsi="Arial" w:cs="Arial"/>
           <w:b/>
           <w:sz w:val="28"/>
+          <w:rtl w:val="1"/>
+          <w:lang w:bidi="he-IL"/>
         </w:rPr>
         <w:t>רשתות תקשורת</w:t>
       </w:r>
@@ -1803,6 +2046,8 @@
           <w:rFonts w:ascii="Arial" w:hAnsi="Arial" w:cs="Arial"/>
           <w:b w:val="0"/>
           <w:sz w:val="24"/>
+          <w:rtl w:val="1"/>
+          <w:lang w:bidi="he-IL"/>
         </w:rPr>
         <w:t>המערכת משתמשת בתקשורת TCP. TCP מתאים לפרויקט כי הוא מספק העברה אמינה של מידע. בצ'אט חשוב שהודעה תגיע בשלמותה ובסדר נכון, ולכן TCP מתאים יותר מ-UDP.</w:t>
       </w:r>
@@ -1818,6 +2063,8 @@
           <w:rFonts w:ascii="Arial" w:hAnsi="Arial" w:cs="Arial"/>
           <w:b w:val="0"/>
           <w:sz w:val="24"/>
+          <w:rtl w:val="1"/>
+          <w:lang w:bidi="he-IL"/>
         </w:rPr>
         <w:t>הלקוח מתחבר לכתובת IP ול-port של השרת. ברירת המחדל היא 127.0.0.1:5050, כלומר ריצה מקומית על אותו מחשב. ניתן לשנות את הכתובת כדי להריץ את המערכת ברשת מקומית.</w:t>
       </w:r>
@@ -1834,6 +2081,8 @@
           <w:rFonts w:ascii="Arial" w:hAnsi="Arial" w:cs="Arial"/>
           <w:b/>
           <w:sz w:val="28"/>
+          <w:rtl w:val="1"/>
+          <w:lang w:bidi="he-IL"/>
         </w:rPr>
         <w:t>מודל לקוח-שרת</w:t>
       </w:r>
@@ -1849,6 +2098,8 @@
           <w:rFonts w:ascii="Arial" w:hAnsi="Arial" w:cs="Arial"/>
           <w:b w:val="0"/>
           <w:sz w:val="24"/>
+          <w:rtl w:val="1"/>
+          <w:lang w:bidi="he-IL"/>
         </w:rPr>
         <w:t>השרת הוא רכיב מרכזי שמקבל חיבורים מכל הלקוחות. כל לקוח שולח בקשות לשרת, והשרת מחליט למי להעביר את המידע. לדוגמה, כאשר משתמש שולח הודעה בחדר, השרת שולח אותה לכל המשתמשים שנמצאים באותו חדר.</w:t>
       </w:r>
@@ -1865,6 +2116,8 @@
           <w:rFonts w:ascii="Arial" w:hAnsi="Arial" w:cs="Arial"/>
           <w:b/>
           <w:sz w:val="28"/>
+          <w:rtl w:val="1"/>
+          <w:lang w:bidi="he-IL"/>
         </w:rPr>
         <w:t>סוקטים</w:t>
       </w:r>
@@ -1880,6 +2133,8 @@
           <w:rFonts w:ascii="Arial" w:hAnsi="Arial" w:cs="Arial"/>
           <w:b w:val="0"/>
           <w:sz w:val="24"/>
+          <w:rtl w:val="1"/>
+          <w:lang w:bidi="he-IL"/>
         </w:rPr>
         <w:t>Socket הוא נקודת קצה לתקשורת ברשת. בפרויקט יש socket בצד השרת שמאזין לחיבורים, ו-socket בצד הלקוח שמתחבר לשרת.</w:t>
       </w:r>
@@ -1896,6 +2151,8 @@
           <w:rFonts w:ascii="Arial" w:hAnsi="Arial" w:cs="Arial"/>
           <w:b/>
           <w:sz w:val="28"/>
+          <w:rtl w:val="1"/>
+          <w:lang w:bidi="he-IL"/>
         </w:rPr>
         <w:t>Thread</w:t>
       </w:r>
@@ -1911,6 +2168,8 @@
           <w:rFonts w:ascii="Arial" w:hAnsi="Arial" w:cs="Arial"/>
           <w:b w:val="0"/>
           <w:sz w:val="24"/>
+          <w:rtl w:val="1"/>
+          <w:lang w:bidi="he-IL"/>
         </w:rPr>
         <w:t>Thread הוא תהליכון שמאפשר להריץ כמה משימות במקביל בתוך אותו תהליך. בפרויקט השרת יוצר Thread לכל לקוח. כך לקוח אחד לא חוסם לקוחות אחרים.</w:t>
       </w:r>
@@ -1927,6 +2186,8 @@
           <w:rFonts w:ascii="Arial" w:hAnsi="Arial" w:cs="Arial"/>
           <w:b/>
           <w:sz w:val="28"/>
+          <w:rtl w:val="1"/>
+          <w:lang w:bidi="he-IL"/>
         </w:rPr>
         <w:t>הצפנה</w:t>
       </w:r>
@@ -1942,6 +2203,8 @@
           <w:rFonts w:ascii="Arial" w:hAnsi="Arial" w:cs="Arial"/>
           <w:b w:val="0"/>
           <w:sz w:val="24"/>
+          <w:rtl w:val="1"/>
+          <w:lang w:bidi="he-IL"/>
         </w:rPr>
         <w:t>המערכת משתמשת ב-TLS כדי להצפין את התעבורה בין הלקוח לשרת. בנוסף, סיסמאות לא נשמרות במאגר כטקסט רגיל אלא כ-hash.</w:t>
       </w:r>
@@ -1958,6 +2221,8 @@
           <w:rFonts w:ascii="Arial" w:hAnsi="Arial" w:cs="Arial"/>
           <w:b/>
           <w:sz w:val="28"/>
+          <w:rtl w:val="1"/>
+          <w:lang w:bidi="he-IL"/>
         </w:rPr>
         <w:t>בסיס נתונים</w:t>
       </w:r>
@@ -1973,6 +2238,8 @@
           <w:rFonts w:ascii="Arial" w:hAnsi="Arial" w:cs="Arial"/>
           <w:b w:val="0"/>
           <w:sz w:val="24"/>
+          <w:rtl w:val="1"/>
+          <w:lang w:bidi="he-IL"/>
         </w:rPr>
         <w:t>המערכת משתמשת ב-SQLite. זהו בסיס נתונים מבוסס קובץ, שמתאים לפרויקט לימודי כי אין צורך להתקין שרת בסיס נתונים חיצוני.</w:t>
       </w:r>
@@ -1995,6 +2262,8 @@
           <w:rFonts w:ascii="Arial" w:hAnsi="Arial" w:cs="Arial"/>
           <w:b/>
           <w:sz w:val="32"/>
+          <w:rtl w:val="1"/>
+          <w:lang w:bidi="he-IL"/>
         </w:rPr>
         <w:t>6. ארכיטקטורת המערכת</w:t>
       </w:r>
@@ -2010,6 +2279,8 @@
           <w:rFonts w:ascii="Arial" w:hAnsi="Arial" w:cs="Arial"/>
           <w:b w:val="0"/>
           <w:sz w:val="24"/>
+          <w:rtl w:val="1"/>
+          <w:lang w:bidi="he-IL"/>
         </w:rPr>
         <w:t>המערכת מחולקת לשלושה חלקים עיקריים:</w:t>
       </w:r>
@@ -2025,6 +2296,8 @@
           <w:rFonts w:ascii="Arial" w:hAnsi="Arial" w:cs="Arial"/>
           <w:b w:val="0"/>
           <w:sz w:val="24"/>
+          <w:rtl w:val="1"/>
+          <w:lang w:bidi="he-IL"/>
         </w:rPr>
         <w:t>1. לקוח גרפי</w:t>
       </w:r>
@@ -2039,6 +2312,8 @@
           <w:rFonts w:ascii="Arial" w:hAnsi="Arial" w:cs="Arial"/>
           <w:b w:val="0"/>
           <w:sz w:val="24"/>
+          <w:rtl w:val="1"/>
+          <w:lang w:bidi="he-IL"/>
         </w:rPr>
         <w:t xml:space="preserve">   קובץ מרכזי: secure_chat/client_gui.py</w:t>
       </w:r>
@@ -2053,6 +2328,8 @@
           <w:rFonts w:ascii="Arial" w:hAnsi="Arial" w:cs="Arial"/>
           <w:b w:val="0"/>
           <w:sz w:val="24"/>
+          <w:rtl w:val="1"/>
+          <w:lang w:bidi="he-IL"/>
         </w:rPr>
         <w:t xml:space="preserve">   תפקיד: ממשק משתמש, התחברות, הרשמה, שליחת הודעות, הצגת הודעות, שליחת קבצים ופתיחת קישורים.</w:t>
       </w:r>
@@ -2068,6 +2345,8 @@
           <w:rFonts w:ascii="Arial" w:hAnsi="Arial" w:cs="Arial"/>
           <w:b w:val="0"/>
           <w:sz w:val="24"/>
+          <w:rtl w:val="1"/>
+          <w:lang w:bidi="he-IL"/>
         </w:rPr>
         <w:t>2. שרת</w:t>
       </w:r>
@@ -2082,6 +2361,8 @@
           <w:rFonts w:ascii="Arial" w:hAnsi="Arial" w:cs="Arial"/>
           <w:b w:val="0"/>
           <w:sz w:val="24"/>
+          <w:rtl w:val="1"/>
+          <w:lang w:bidi="he-IL"/>
         </w:rPr>
         <w:t xml:space="preserve">   קובץ מרכזי: secure_chat/server.py</w:t>
       </w:r>
@@ -2096,6 +2377,8 @@
           <w:rFonts w:ascii="Arial" w:hAnsi="Arial" w:cs="Arial"/>
           <w:b w:val="0"/>
           <w:sz w:val="24"/>
+          <w:rtl w:val="1"/>
+          <w:lang w:bidi="he-IL"/>
         </w:rPr>
         <w:t xml:space="preserve">   תפקיד: קבלת חיבורים, אימות משתמשים, ניהול חדרים, הפצת הודעות, קבלת קבצים וניהול פקודות מתקדמות.</w:t>
       </w:r>
@@ -2111,6 +2394,8 @@
           <w:rFonts w:ascii="Arial" w:hAnsi="Arial" w:cs="Arial"/>
           <w:b w:val="0"/>
           <w:sz w:val="24"/>
+          <w:rtl w:val="1"/>
+          <w:lang w:bidi="he-IL"/>
         </w:rPr>
         <w:t>3. שכבות עזר</w:t>
       </w:r>
@@ -2125,6 +2410,8 @@
           <w:rFonts w:ascii="Arial" w:hAnsi="Arial" w:cs="Arial"/>
           <w:b w:val="0"/>
           <w:sz w:val="24"/>
+          <w:rtl w:val="1"/>
+          <w:lang w:bidi="he-IL"/>
         </w:rPr>
         <w:t xml:space="preserve">   קבצים מרכזיים: protocol.py, storage.py, security.py, models.py, config.py</w:t>
       </w:r>
@@ -2139,6 +2426,8 @@
           <w:rFonts w:ascii="Arial" w:hAnsi="Arial" w:cs="Arial"/>
           <w:b w:val="0"/>
           <w:sz w:val="24"/>
+          <w:rtl w:val="1"/>
+          <w:lang w:bidi="he-IL"/>
         </w:rPr>
         <w:t xml:space="preserve">   תפקיד: פרוטוקול, בסיס נתונים, אבטחה, מודלים וקבועים.</w:t>
       </w:r>
@@ -2155,6 +2444,8 @@
           <w:rFonts w:ascii="Arial" w:hAnsi="Arial" w:cs="Arial"/>
           <w:b/>
           <w:sz w:val="28"/>
+          <w:rtl w:val="1"/>
+          <w:lang w:bidi="he-IL"/>
         </w:rPr>
         <w:t>תרשים ארכיטקטורה</w:t>
       </w:r>
@@ -2354,6 +2645,8 @@
           <w:rFonts w:ascii="Arial" w:hAnsi="Arial" w:cs="Arial"/>
           <w:b/>
           <w:sz w:val="28"/>
+          <w:rtl w:val="1"/>
+          <w:lang w:bidi="he-IL"/>
         </w:rPr>
         <w:t>זרימת מידע בסיסית</w:t>
       </w:r>
@@ -2369,6 +2662,8 @@
           <w:rFonts w:ascii="Arial" w:hAnsi="Arial" w:cs="Arial"/>
           <w:b w:val="0"/>
           <w:sz w:val="24"/>
+          <w:rtl w:val="1"/>
+          <w:lang w:bidi="he-IL"/>
         </w:rPr>
         <w:t>1. הלקוח מתחבר לשרת דרך socket מוצפן.</w:t>
       </w:r>
@@ -2383,6 +2678,8 @@
           <w:rFonts w:ascii="Arial" w:hAnsi="Arial" w:cs="Arial"/>
           <w:b w:val="0"/>
           <w:sz w:val="24"/>
+          <w:rtl w:val="1"/>
+          <w:lang w:bidi="he-IL"/>
         </w:rPr>
         <w:t>2. הלקוח שולח בקשת הרשמה או התחברות.</w:t>
       </w:r>
@@ -2397,6 +2694,8 @@
           <w:rFonts w:ascii="Arial" w:hAnsi="Arial" w:cs="Arial"/>
           <w:b w:val="0"/>
           <w:sz w:val="24"/>
+          <w:rtl w:val="1"/>
+          <w:lang w:bidi="he-IL"/>
         </w:rPr>
         <w:t>3. השרת בודק את הפרטים מול בסיס הנתונים.</w:t>
       </w:r>
@@ -2411,6 +2710,8 @@
           <w:rFonts w:ascii="Arial" w:hAnsi="Arial" w:cs="Arial"/>
           <w:b w:val="0"/>
           <w:sz w:val="24"/>
+          <w:rtl w:val="1"/>
+          <w:lang w:bidi="he-IL"/>
         </w:rPr>
         <w:t>4. לאחר התחברות מוצלחת הלקוח נכנס למסך הצ'אט.</w:t>
       </w:r>
@@ -2425,6 +2726,8 @@
           <w:rFonts w:ascii="Arial" w:hAnsi="Arial" w:cs="Arial"/>
           <w:b w:val="0"/>
           <w:sz w:val="24"/>
+          <w:rtl w:val="1"/>
+          <w:lang w:bidi="he-IL"/>
         </w:rPr>
         <w:t>5. המשתמש שולח הודעה או קובץ.</w:t>
       </w:r>
@@ -2439,6 +2742,8 @@
           <w:rFonts w:ascii="Arial" w:hAnsi="Arial" w:cs="Arial"/>
           <w:b w:val="0"/>
           <w:sz w:val="24"/>
+          <w:rtl w:val="1"/>
+          <w:lang w:bidi="he-IL"/>
         </w:rPr>
         <w:t>6. השרת מקבל את המידע, בודק אותו ושולח אותו למשתמשים המתאימים.</w:t>
       </w:r>
@@ -2461,6 +2766,8 @@
           <w:rFonts w:ascii="Arial" w:hAnsi="Arial" w:cs="Arial"/>
           <w:b/>
           <w:sz w:val="32"/>
+          <w:rtl w:val="1"/>
+          <w:lang w:bidi="he-IL"/>
         </w:rPr>
         <w:t>7. חלוקה למודולים</w:t>
       </w:r>
@@ -2477,6 +2784,8 @@
           <w:rFonts w:ascii="Arial" w:hAnsi="Arial" w:cs="Arial"/>
           <w:b/>
           <w:sz w:val="28"/>
+          <w:rtl w:val="1"/>
+          <w:lang w:bidi="he-IL"/>
         </w:rPr>
         <w:t>`client_gui.py`</w:t>
       </w:r>
@@ -2492,6 +2801,8 @@
           <w:rFonts w:ascii="Arial" w:hAnsi="Arial" w:cs="Arial"/>
           <w:b w:val="0"/>
           <w:sz w:val="24"/>
+          <w:rtl w:val="1"/>
+          <w:lang w:bidi="he-IL"/>
         </w:rPr>
         <w:t>מודול זה אחראי על הצד הגרפי של המשתמש. הוא בונה את מסך ההתחברות, מסך הצ'אט, רשימת החדרים, רשימת המשתמשים, תצוגת ההודעות, כפתורי אימוג'ים, כפתורי שליחת קבצים וקישורים לפתיחת קבצים.</w:t>
       </w:r>
@@ -2508,6 +2819,8 @@
           <w:rFonts w:ascii="Arial" w:hAnsi="Arial" w:cs="Arial"/>
           <w:b/>
           <w:sz w:val="28"/>
+          <w:rtl w:val="1"/>
+          <w:lang w:bidi="he-IL"/>
         </w:rPr>
         <w:t>`server.py`</w:t>
       </w:r>
@@ -2523,6 +2836,8 @@
           <w:rFonts w:ascii="Arial" w:hAnsi="Arial" w:cs="Arial"/>
           <w:b w:val="0"/>
           <w:sz w:val="24"/>
+          <w:rtl w:val="1"/>
+          <w:lang w:bidi="he-IL"/>
         </w:rPr>
         <w:t>מודול זה אחראי על שרת התקשורת. הוא מאזין לחיבורים, יוצר Thread לכל לקוח, מפענח packets שמתקבלים, מפיץ הודעות ומטפל בפקודות מתקדמות.</w:t>
       </w:r>
@@ -2539,6 +2854,8 @@
           <w:rFonts w:ascii="Arial" w:hAnsi="Arial" w:cs="Arial"/>
           <w:b/>
           <w:sz w:val="28"/>
+          <w:rtl w:val="1"/>
+          <w:lang w:bidi="he-IL"/>
         </w:rPr>
         <w:t>`protocol.py`</w:t>
       </w:r>
@@ -2554,6 +2871,8 @@
           <w:rFonts w:ascii="Arial" w:hAnsi="Arial" w:cs="Arial"/>
           <w:b w:val="0"/>
           <w:sz w:val="24"/>
+          <w:rtl w:val="1"/>
+          <w:lang w:bidi="he-IL"/>
         </w:rPr>
         <w:t>מודול זה מגדיר את פרוטוקול התקשורת. כל הודעה נשלחת כמבנה JSON עם כותרת באורך 4 בתים שמציינת את גודל ההודעה.</w:t>
       </w:r>
@@ -2570,6 +2889,8 @@
           <w:rFonts w:ascii="Arial" w:hAnsi="Arial" w:cs="Arial"/>
           <w:b/>
           <w:sz w:val="28"/>
+          <w:rtl w:val="1"/>
+          <w:lang w:bidi="he-IL"/>
         </w:rPr>
         <w:t>`storage.py`</w:t>
       </w:r>
@@ -2585,6 +2906,8 @@
           <w:rFonts w:ascii="Arial" w:hAnsi="Arial" w:cs="Arial"/>
           <w:b w:val="0"/>
           <w:sz w:val="24"/>
+          <w:rtl w:val="1"/>
+          <w:lang w:bidi="he-IL"/>
         </w:rPr>
         <w:t>מודול זה אחראי על שמירה ושליפה של נתונים. הוא משתמש ב-SQLite ושומר משתמשים, הודעות, חדרים, לוגים, חברים והיסטוריית הורדות.</w:t>
       </w:r>
@@ -2601,6 +2924,8 @@
           <w:rFonts w:ascii="Arial" w:hAnsi="Arial" w:cs="Arial"/>
           <w:b/>
           <w:sz w:val="28"/>
+          <w:rtl w:val="1"/>
+          <w:lang w:bidi="he-IL"/>
         </w:rPr>
         <w:t>`security.py`</w:t>
       </w:r>
@@ -2616,6 +2941,8 @@
           <w:rFonts w:ascii="Arial" w:hAnsi="Arial" w:cs="Arial"/>
           <w:b w:val="0"/>
           <w:sz w:val="24"/>
+          <w:rtl w:val="1"/>
+          <w:lang w:bidi="he-IL"/>
         </w:rPr>
         <w:t>מודול זה אחראי על אבטחה: בדיקת קלטים, hashing לסיסמאות, יצירת TLS context ותעודות פיתוח.</w:t>
       </w:r>
@@ -2632,6 +2959,8 @@
           <w:rFonts w:ascii="Arial" w:hAnsi="Arial" w:cs="Arial"/>
           <w:b/>
           <w:sz w:val="28"/>
+          <w:rtl w:val="1"/>
+          <w:lang w:bidi="he-IL"/>
         </w:rPr>
         <w:t>`models.py`</w:t>
       </w:r>
@@ -2647,6 +2976,8 @@
           <w:rFonts w:ascii="Arial" w:hAnsi="Arial" w:cs="Arial"/>
           <w:b w:val="0"/>
           <w:sz w:val="24"/>
+          <w:rtl w:val="1"/>
+          <w:lang w:bidi="he-IL"/>
         </w:rPr>
         <w:t>מודול זה כולל מחלקות נתונים כמו User, ChatMessage, ClientInfo ו-ServerEvent.</w:t>
       </w:r>
@@ -2663,6 +2994,8 @@
           <w:rFonts w:ascii="Arial" w:hAnsi="Arial" w:cs="Arial"/>
           <w:b/>
           <w:sz w:val="28"/>
+          <w:rtl w:val="1"/>
+          <w:lang w:bidi="he-IL"/>
         </w:rPr>
         <w:t>`config.py`</w:t>
       </w:r>
@@ -2678,6 +3011,8 @@
           <w:rFonts w:ascii="Arial" w:hAnsi="Arial" w:cs="Arial"/>
           <w:b w:val="0"/>
           <w:sz w:val="24"/>
+          <w:rtl w:val="1"/>
+          <w:lang w:bidi="he-IL"/>
         </w:rPr>
         <w:t>מודול זה כולל קבועים מרכזיים כמו כתובת ברירת מחדל, port, נתיבי קבצים ומגבלות גודל.</w:t>
       </w:r>
@@ -2700,6 +3035,8 @@
           <w:rFonts w:ascii="Arial" w:hAnsi="Arial" w:cs="Arial"/>
           <w:b/>
           <w:sz w:val="32"/>
+          <w:rtl w:val="1"/>
+          <w:lang w:bidi="he-IL"/>
         </w:rPr>
         <w:t>8. פרוטוקול התקשורת</w:t>
       </w:r>
@@ -2715,6 +3052,8 @@
           <w:rFonts w:ascii="Arial" w:hAnsi="Arial" w:cs="Arial"/>
           <w:b w:val="0"/>
           <w:sz w:val="24"/>
+          <w:rtl w:val="1"/>
+          <w:lang w:bidi="he-IL"/>
         </w:rPr>
         <w:t>הפרויקט מממש פרוטוקול עצמאי מעל TCP. הפרוטוקול בנוי כך:</w:t>
       </w:r>
@@ -2730,6 +3069,8 @@
           <w:rFonts w:ascii="Arial" w:hAnsi="Arial" w:cs="Arial"/>
           <w:b w:val="0"/>
           <w:sz w:val="24"/>
+          <w:rtl w:val="1"/>
+          <w:lang w:bidi="he-IL"/>
         </w:rPr>
         <w:t>1. 4 בתים ראשונים</w:t>
       </w:r>
@@ -2744,6 +3085,8 @@
           <w:rFonts w:ascii="Arial" w:hAnsi="Arial" w:cs="Arial"/>
           <w:b w:val="0"/>
           <w:sz w:val="24"/>
+          <w:rtl w:val="1"/>
+          <w:lang w:bidi="he-IL"/>
         </w:rPr>
         <w:t xml:space="preserve">   מציינים את אורך ה-payload.</w:t>
       </w:r>
@@ -2759,6 +3102,8 @@
           <w:rFonts w:ascii="Arial" w:hAnsi="Arial" w:cs="Arial"/>
           <w:b w:val="0"/>
           <w:sz w:val="24"/>
+          <w:rtl w:val="1"/>
+          <w:lang w:bidi="he-IL"/>
         </w:rPr>
         <w:t>2. Payload</w:t>
       </w:r>
@@ -2773,6 +3118,8 @@
           <w:rFonts w:ascii="Arial" w:hAnsi="Arial" w:cs="Arial"/>
           <w:b w:val="0"/>
           <w:sz w:val="24"/>
+          <w:rtl w:val="1"/>
+          <w:lang w:bidi="he-IL"/>
         </w:rPr>
         <w:t xml:space="preserve">   מחרוזת JSON בקידוד UTF-8.</w:t>
       </w:r>
@@ -2789,6 +3136,8 @@
           <w:rFonts w:ascii="Arial" w:hAnsi="Arial" w:cs="Arial"/>
           <w:b/>
           <w:sz w:val="28"/>
+          <w:rtl w:val="1"/>
+          <w:lang w:bidi="he-IL"/>
         </w:rPr>
         <w:t>דוגמת packet להרשמה</w:t>
       </w:r>
@@ -2871,6 +3220,8 @@
           <w:rFonts w:ascii="Arial" w:hAnsi="Arial" w:cs="Arial"/>
           <w:b/>
           <w:sz w:val="28"/>
+          <w:rtl w:val="1"/>
+          <w:lang w:bidi="he-IL"/>
         </w:rPr>
         <w:t>דוגמת packet להתחברות</w:t>
       </w:r>
@@ -2953,6 +3304,8 @@
           <w:rFonts w:ascii="Arial" w:hAnsi="Arial" w:cs="Arial"/>
           <w:b/>
           <w:sz w:val="28"/>
+          <w:rtl w:val="1"/>
+          <w:lang w:bidi="he-IL"/>
         </w:rPr>
         <w:t>דוגמת packet להודעת צ'אט</w:t>
       </w:r>
@@ -3022,6 +3375,8 @@
           <w:rFonts w:ascii="Arial" w:hAnsi="Arial" w:cs="Arial"/>
           <w:b/>
           <w:sz w:val="28"/>
+          <w:rtl w:val="1"/>
+          <w:lang w:bidi="he-IL"/>
         </w:rPr>
         <w:t>דוגמת packet לקובץ</w:t>
       </w:r>
@@ -3130,6 +3485,8 @@
           <w:rFonts w:ascii="Arial" w:hAnsi="Arial" w:cs="Arial"/>
           <w:b/>
           <w:sz w:val="28"/>
+          <w:rtl w:val="1"/>
+          <w:lang w:bidi="he-IL"/>
         </w:rPr>
         <w:t>סוגי הודעות מרכזיים</w:t>
       </w:r>
@@ -3145,6 +3502,8 @@
           <w:rFonts w:ascii="Arial" w:hAnsi="Arial" w:cs="Arial"/>
           <w:b w:val="0"/>
           <w:sz w:val="24"/>
+          <w:rtl w:val="1"/>
+          <w:lang w:bidi="he-IL"/>
         </w:rPr>
         <w:t>1. register - הרשמה.</w:t>
       </w:r>
@@ -3159,6 +3518,8 @@
           <w:rFonts w:ascii="Arial" w:hAnsi="Arial" w:cs="Arial"/>
           <w:b w:val="0"/>
           <w:sz w:val="24"/>
+          <w:rtl w:val="1"/>
+          <w:lang w:bidi="he-IL"/>
         </w:rPr>
         <w:t>2. login - התחברות.</w:t>
       </w:r>
@@ -3173,6 +3534,8 @@
           <w:rFonts w:ascii="Arial" w:hAnsi="Arial" w:cs="Arial"/>
           <w:b w:val="0"/>
           <w:sz w:val="24"/>
+          <w:rtl w:val="1"/>
+          <w:lang w:bidi="he-IL"/>
         </w:rPr>
         <w:t>3. message - הודעת צ'אט רגילה.</w:t>
       </w:r>
@@ -3187,6 +3550,8 @@
           <w:rFonts w:ascii="Arial" w:hAnsi="Arial" w:cs="Arial"/>
           <w:b w:val="0"/>
           <w:sz w:val="24"/>
+          <w:rtl w:val="1"/>
+          <w:lang w:bidi="he-IL"/>
         </w:rPr>
         <w:t>4. file - שליחת קובץ, תמונה או סרטון.</w:t>
       </w:r>
@@ -3201,6 +3566,8 @@
           <w:rFonts w:ascii="Arial" w:hAnsi="Arial" w:cs="Arial"/>
           <w:b w:val="0"/>
           <w:sz w:val="24"/>
+          <w:rtl w:val="1"/>
+          <w:lang w:bidi="he-IL"/>
         </w:rPr>
         <w:t>5. join - הצטרפות לחדר.</w:t>
       </w:r>
@@ -3215,6 +3582,8 @@
           <w:rFonts w:ascii="Arial" w:hAnsi="Arial" w:cs="Arial"/>
           <w:b w:val="0"/>
           <w:sz w:val="24"/>
+          <w:rtl w:val="1"/>
+          <w:lang w:bidi="he-IL"/>
         </w:rPr>
         <w:t>6. create_room - יצירת חדר.</w:t>
       </w:r>
@@ -3229,6 +3598,8 @@
           <w:rFonts w:ascii="Arial" w:hAnsi="Arial" w:cs="Arial"/>
           <w:b w:val="0"/>
           <w:sz w:val="24"/>
+          <w:rtl w:val="1"/>
+          <w:lang w:bidi="he-IL"/>
         </w:rPr>
         <w:t>7. rooms - בקשת רשימת חדרים.</w:t>
       </w:r>
@@ -3243,6 +3614,8 @@
           <w:rFonts w:ascii="Arial" w:hAnsi="Arial" w:cs="Arial"/>
           <w:b w:val="0"/>
           <w:sz w:val="24"/>
+          <w:rtl w:val="1"/>
+          <w:lang w:bidi="he-IL"/>
         </w:rPr>
         <w:t>8. users - בקשת רשימת משתמשים.</w:t>
       </w:r>
@@ -3257,6 +3630,8 @@
           <w:rFonts w:ascii="Arial" w:hAnsi="Arial" w:cs="Arial"/>
           <w:b w:val="0"/>
           <w:sz w:val="24"/>
+          <w:rtl w:val="1"/>
+          <w:lang w:bidi="he-IL"/>
         </w:rPr>
         <w:t>9. command - פקודות מתקדמות.</w:t>
       </w:r>
@@ -3271,6 +3646,8 @@
           <w:rFonts w:ascii="Arial" w:hAnsi="Arial" w:cs="Arial"/>
           <w:b w:val="0"/>
           <w:sz w:val="24"/>
+          <w:rtl w:val="1"/>
+          <w:lang w:bidi="he-IL"/>
         </w:rPr>
         <w:t>10. typing - חיווי הקלדה.</w:t>
       </w:r>
@@ -3285,6 +3662,8 @@
           <w:rFonts w:ascii="Arial" w:hAnsi="Arial" w:cs="Arial"/>
           <w:b w:val="0"/>
           <w:sz w:val="24"/>
+          <w:rtl w:val="1"/>
+          <w:lang w:bidi="he-IL"/>
         </w:rPr>
         <w:t>11. read_receipt - אישור קריאה.</w:t>
       </w:r>
@@ -3299,6 +3678,8 @@
           <w:rFonts w:ascii="Arial" w:hAnsi="Arial" w:cs="Arial"/>
           <w:b w:val="0"/>
           <w:sz w:val="24"/>
+          <w:rtl w:val="1"/>
+          <w:lang w:bidi="he-IL"/>
         </w:rPr>
         <w:t>12. download_event - רישום פתיחת קובץ.</w:t>
       </w:r>
@@ -3321,6 +3702,8 @@
           <w:rFonts w:ascii="Arial" w:hAnsi="Arial" w:cs="Arial"/>
           <w:b/>
           <w:sz w:val="32"/>
+          <w:rtl w:val="1"/>
+          <w:lang w:bidi="he-IL"/>
         </w:rPr>
         <w:t>9. אלגוריתמים מרכזיים</w:t>
       </w:r>
@@ -3337,6 +3720,8 @@
           <w:rFonts w:ascii="Arial" w:hAnsi="Arial" w:cs="Arial"/>
           <w:b/>
           <w:sz w:val="28"/>
+          <w:rtl w:val="1"/>
+          <w:lang w:bidi="he-IL"/>
         </w:rPr>
         <w:t>אלגוריתם קבלת packet</w:t>
       </w:r>
@@ -3352,6 +3737,8 @@
           <w:rFonts w:ascii="Arial" w:hAnsi="Arial" w:cs="Arial"/>
           <w:b w:val="0"/>
           <w:sz w:val="24"/>
+          <w:rtl w:val="1"/>
+          <w:lang w:bidi="he-IL"/>
         </w:rPr>
         <w:t>1. קוראים 4 בתים מה-socket.</w:t>
       </w:r>
@@ -3366,6 +3753,8 @@
           <w:rFonts w:ascii="Arial" w:hAnsi="Arial" w:cs="Arial"/>
           <w:b w:val="0"/>
           <w:sz w:val="24"/>
+          <w:rtl w:val="1"/>
+          <w:lang w:bidi="he-IL"/>
         </w:rPr>
         <w:t>2. מפרשים אותם כמספר שמייצג את גודל ה-payload.</w:t>
       </w:r>
@@ -3380,6 +3769,8 @@
           <w:rFonts w:ascii="Arial" w:hAnsi="Arial" w:cs="Arial"/>
           <w:b w:val="0"/>
           <w:sz w:val="24"/>
+          <w:rtl w:val="1"/>
+          <w:lang w:bidi="he-IL"/>
         </w:rPr>
         <w:t>3. בודקים שהגודל אינו חורג מהמותר.</w:t>
       </w:r>
@@ -3394,6 +3785,8 @@
           <w:rFonts w:ascii="Arial" w:hAnsi="Arial" w:cs="Arial"/>
           <w:b w:val="0"/>
           <w:sz w:val="24"/>
+          <w:rtl w:val="1"/>
+          <w:lang w:bidi="he-IL"/>
         </w:rPr>
         <w:t>4. קוראים בדיוק את כמות הבתים שנקבעה.</w:t>
       </w:r>
@@ -3408,6 +3801,8 @@
           <w:rFonts w:ascii="Arial" w:hAnsi="Arial" w:cs="Arial"/>
           <w:b w:val="0"/>
           <w:sz w:val="24"/>
+          <w:rtl w:val="1"/>
+          <w:lang w:bidi="he-IL"/>
         </w:rPr>
         <w:t>5. מפענחים את המידע מ-UTF-8.</w:t>
       </w:r>
@@ -3422,6 +3817,8 @@
           <w:rFonts w:ascii="Arial" w:hAnsi="Arial" w:cs="Arial"/>
           <w:b w:val="0"/>
           <w:sz w:val="24"/>
+          <w:rtl w:val="1"/>
+          <w:lang w:bidi="he-IL"/>
         </w:rPr>
         <w:t>6. ממירים את הטקסט ל-JSON.</w:t>
       </w:r>
@@ -3436,6 +3833,8 @@
           <w:rFonts w:ascii="Arial" w:hAnsi="Arial" w:cs="Arial"/>
           <w:b w:val="0"/>
           <w:sz w:val="24"/>
+          <w:rtl w:val="1"/>
+          <w:lang w:bidi="he-IL"/>
         </w:rPr>
         <w:t>7. בודקים שקיים שדה type.</w:t>
       </w:r>
@@ -3452,6 +3851,8 @@
           <w:rFonts w:ascii="Arial" w:hAnsi="Arial" w:cs="Arial"/>
           <w:b/>
           <w:sz w:val="28"/>
+          <w:rtl w:val="1"/>
+          <w:lang w:bidi="he-IL"/>
         </w:rPr>
         <w:t>אלגוריתם שליחת הודעה לחדר</w:t>
       </w:r>
@@ -3467,6 +3868,8 @@
           <w:rFonts w:ascii="Arial" w:hAnsi="Arial" w:cs="Arial"/>
           <w:b w:val="0"/>
           <w:sz w:val="24"/>
+          <w:rtl w:val="1"/>
+          <w:lang w:bidi="he-IL"/>
         </w:rPr>
         <w:t>1. הלקוח שולח packet מסוג message.</w:t>
       </w:r>
@@ -3481,6 +3884,8 @@
           <w:rFonts w:ascii="Arial" w:hAnsi="Arial" w:cs="Arial"/>
           <w:b w:val="0"/>
           <w:sz w:val="24"/>
+          <w:rtl w:val="1"/>
+          <w:lang w:bidi="he-IL"/>
         </w:rPr>
         <w:t>2. השרת בודק שהלקוח מחובר.</w:t>
       </w:r>
@@ -3495,6 +3900,8 @@
           <w:rFonts w:ascii="Arial" w:hAnsi="Arial" w:cs="Arial"/>
           <w:b w:val="0"/>
           <w:sz w:val="24"/>
+          <w:rtl w:val="1"/>
+          <w:lang w:bidi="he-IL"/>
         </w:rPr>
         <w:t>3. השרת בודק שההודעה אינה ריקה ואינה ארוכה מדי.</w:t>
       </w:r>
@@ -3509,6 +3916,8 @@
           <w:rFonts w:ascii="Arial" w:hAnsi="Arial" w:cs="Arial"/>
           <w:b w:val="0"/>
           <w:sz w:val="24"/>
+          <w:rtl w:val="1"/>
+          <w:lang w:bidi="he-IL"/>
         </w:rPr>
         <w:t>4. השרת שומר את ההודעה בבסיס הנתונים.</w:t>
       </w:r>
@@ -3523,6 +3932,8 @@
           <w:rFonts w:ascii="Arial" w:hAnsi="Arial" w:cs="Arial"/>
           <w:b w:val="0"/>
           <w:sz w:val="24"/>
+          <w:rtl w:val="1"/>
+          <w:lang w:bidi="he-IL"/>
         </w:rPr>
         <w:t>5. השרת עובר על כל הלקוחות המחוברים.</w:t>
       </w:r>
@@ -3537,6 +3948,8 @@
           <w:rFonts w:ascii="Arial" w:hAnsi="Arial" w:cs="Arial"/>
           <w:b w:val="0"/>
           <w:sz w:val="24"/>
+          <w:rtl w:val="1"/>
+          <w:lang w:bidi="he-IL"/>
         </w:rPr>
         <w:t>6. השרת שולח את ההודעה רק ללקוחות שנמצאים באותו חדר.</w:t>
       </w:r>
@@ -3553,6 +3966,8 @@
           <w:rFonts w:ascii="Arial" w:hAnsi="Arial" w:cs="Arial"/>
           <w:b/>
           <w:sz w:val="28"/>
+          <w:rtl w:val="1"/>
+          <w:lang w:bidi="he-IL"/>
         </w:rPr>
         <w:t>אלגוריתם הרשמה</w:t>
       </w:r>
@@ -3568,6 +3983,8 @@
           <w:rFonts w:ascii="Arial" w:hAnsi="Arial" w:cs="Arial"/>
           <w:b w:val="0"/>
           <w:sz w:val="24"/>
+          <w:rtl w:val="1"/>
+          <w:lang w:bidi="he-IL"/>
         </w:rPr>
         <w:t>1. הלקוח שולח שם משתמש וסיסמה.</w:t>
       </w:r>
@@ -3582,6 +3999,8 @@
           <w:rFonts w:ascii="Arial" w:hAnsi="Arial" w:cs="Arial"/>
           <w:b w:val="0"/>
           <w:sz w:val="24"/>
+          <w:rtl w:val="1"/>
+          <w:lang w:bidi="he-IL"/>
         </w:rPr>
         <w:t>2. השרת בודק ששם המשתמש חוקי.</w:t>
       </w:r>
@@ -3596,6 +4015,8 @@
           <w:rFonts w:ascii="Arial" w:hAnsi="Arial" w:cs="Arial"/>
           <w:b w:val="0"/>
           <w:sz w:val="24"/>
+          <w:rtl w:val="1"/>
+          <w:lang w:bidi="he-IL"/>
         </w:rPr>
         <w:t>3. השרת בודק שהסיסמה באורך מתאים.</w:t>
       </w:r>
@@ -3610,6 +4031,8 @@
           <w:rFonts w:ascii="Arial" w:hAnsi="Arial" w:cs="Arial"/>
           <w:b w:val="0"/>
           <w:sz w:val="24"/>
+          <w:rtl w:val="1"/>
+          <w:lang w:bidi="he-IL"/>
         </w:rPr>
         <w:t>4. השרת יוצר salt אקראי.</w:t>
       </w:r>
@@ -3624,6 +4047,8 @@
           <w:rFonts w:ascii="Arial" w:hAnsi="Arial" w:cs="Arial"/>
           <w:b w:val="0"/>
           <w:sz w:val="24"/>
+          <w:rtl w:val="1"/>
+          <w:lang w:bidi="he-IL"/>
         </w:rPr>
         <w:t>5. השרת מחשב hash עם PBKDF2.</w:t>
       </w:r>
@@ -3638,6 +4063,8 @@
           <w:rFonts w:ascii="Arial" w:hAnsi="Arial" w:cs="Arial"/>
           <w:b w:val="0"/>
           <w:sz w:val="24"/>
+          <w:rtl w:val="1"/>
+          <w:lang w:bidi="he-IL"/>
         </w:rPr>
         <w:t>6. השרת שומר את שם המשתמש וה-hash בבסיס הנתונים.</w:t>
       </w:r>
@@ -3652,6 +4079,8 @@
           <w:rFonts w:ascii="Arial" w:hAnsi="Arial" w:cs="Arial"/>
           <w:b w:val="0"/>
           <w:sz w:val="24"/>
+          <w:rtl w:val="1"/>
+          <w:lang w:bidi="he-IL"/>
         </w:rPr>
         <w:t>7. אם שם המשתמש כבר קיים, מוחזרת הודעת שגיאה.</w:t>
       </w:r>
@@ -3668,6 +4097,8 @@
           <w:rFonts w:ascii="Arial" w:hAnsi="Arial" w:cs="Arial"/>
           <w:b/>
           <w:sz w:val="28"/>
+          <w:rtl w:val="1"/>
+          <w:lang w:bidi="he-IL"/>
         </w:rPr>
         <w:t>אלגוריתם שליחת קובץ</w:t>
       </w:r>
@@ -3683,6 +4114,8 @@
           <w:rFonts w:ascii="Arial" w:hAnsi="Arial" w:cs="Arial"/>
           <w:b w:val="0"/>
           <w:sz w:val="24"/>
+          <w:rtl w:val="1"/>
+          <w:lang w:bidi="he-IL"/>
         </w:rPr>
         <w:t>1. המשתמש בוחר קובץ דרך הממשק.</w:t>
       </w:r>
@@ -3697,6 +4130,8 @@
           <w:rFonts w:ascii="Arial" w:hAnsi="Arial" w:cs="Arial"/>
           <w:b w:val="0"/>
           <w:sz w:val="24"/>
+          <w:rtl w:val="1"/>
+          <w:lang w:bidi="he-IL"/>
         </w:rPr>
         <w:t>2. הלקוח בודק שהקובץ אינו גדול מדי.</w:t>
       </w:r>
@@ -3711,6 +4146,8 @@
           <w:rFonts w:ascii="Arial" w:hAnsi="Arial" w:cs="Arial"/>
           <w:b w:val="0"/>
           <w:sz w:val="24"/>
+          <w:rtl w:val="1"/>
+          <w:lang w:bidi="he-IL"/>
         </w:rPr>
         <w:t>3. הלקוח קורא את הקובץ וממיר אותו ל-base64.</w:t>
       </w:r>
@@ -3725,6 +4162,8 @@
           <w:rFonts w:ascii="Arial" w:hAnsi="Arial" w:cs="Arial"/>
           <w:b w:val="0"/>
           <w:sz w:val="24"/>
+          <w:rtl w:val="1"/>
+          <w:lang w:bidi="he-IL"/>
         </w:rPr>
         <w:t>4. הלקוח שולח packet מסוג file.</w:t>
       </w:r>
@@ -3739,6 +4178,8 @@
           <w:rFonts w:ascii="Arial" w:hAnsi="Arial" w:cs="Arial"/>
           <w:b w:val="0"/>
           <w:sz w:val="24"/>
+          <w:rtl w:val="1"/>
+          <w:lang w:bidi="he-IL"/>
         </w:rPr>
         <w:t>5. השרת מפענח את base64.</w:t>
       </w:r>
@@ -3753,6 +4194,8 @@
           <w:rFonts w:ascii="Arial" w:hAnsi="Arial" w:cs="Arial"/>
           <w:b w:val="0"/>
           <w:sz w:val="24"/>
+          <w:rtl w:val="1"/>
+          <w:lang w:bidi="he-IL"/>
         </w:rPr>
         <w:t>6. השרת שומר עותק בתיקיית uploads.</w:t>
       </w:r>
@@ -3767,6 +4210,8 @@
           <w:rFonts w:ascii="Arial" w:hAnsi="Arial" w:cs="Arial"/>
           <w:b w:val="0"/>
           <w:sz w:val="24"/>
+          <w:rtl w:val="1"/>
+          <w:lang w:bidi="he-IL"/>
         </w:rPr>
         <w:t>7. השרת שולח את הקובץ לכל המשתמשים בחדר.</w:t>
       </w:r>
@@ -3781,6 +4226,8 @@
           <w:rFonts w:ascii="Arial" w:hAnsi="Arial" w:cs="Arial"/>
           <w:b w:val="0"/>
           <w:sz w:val="24"/>
+          <w:rtl w:val="1"/>
+          <w:lang w:bidi="he-IL"/>
         </w:rPr>
         <w:t>8. הלקוח המקבל שומר את הקובץ בתיקיית downloads.</w:t>
       </w:r>
@@ -3795,6 +4242,8 @@
           <w:rFonts w:ascii="Arial" w:hAnsi="Arial" w:cs="Arial"/>
           <w:b w:val="0"/>
           <w:sz w:val="24"/>
+          <w:rtl w:val="1"/>
+          <w:lang w:bidi="he-IL"/>
         </w:rPr>
         <w:t>9. אם מדובר בתמונה, מוצגת תצוגה מקדימה במסך הצ'אט.</w:t>
       </w:r>
@@ -3817,6 +4266,8 @@
           <w:rFonts w:ascii="Arial" w:hAnsi="Arial" w:cs="Arial"/>
           <w:b/>
           <w:sz w:val="32"/>
+          <w:rtl w:val="1"/>
+          <w:lang w:bidi="he-IL"/>
         </w:rPr>
         <w:t>10. אבטחת מידע וחולשות</w:t>
       </w:r>
@@ -3833,6 +4284,8 @@
           <w:rFonts w:ascii="Arial" w:hAnsi="Arial" w:cs="Arial"/>
           <w:b/>
           <w:sz w:val="28"/>
+          <w:rtl w:val="1"/>
+          <w:lang w:bidi="he-IL"/>
         </w:rPr>
         <w:t>הצפנת תקשורת</w:t>
       </w:r>
@@ -3848,6 +4301,8 @@
           <w:rFonts w:ascii="Arial" w:hAnsi="Arial" w:cs="Arial"/>
           <w:b w:val="0"/>
           <w:sz w:val="24"/>
+          <w:rtl w:val="1"/>
+          <w:lang w:bidi="he-IL"/>
         </w:rPr>
         <w:t>המערכת משתמשת ב-TLS ולכן המידע שעובר בין הלקוח לשרת מוצפן. הדבר מקטין את הסיכון שמאזין ברשת יראה הודעות, סיסמאות או קבצים.</w:t>
       </w:r>
@@ -3864,6 +4319,8 @@
           <w:rFonts w:ascii="Arial" w:hAnsi="Arial" w:cs="Arial"/>
           <w:b/>
           <w:sz w:val="28"/>
+          <w:rtl w:val="1"/>
+          <w:lang w:bidi="he-IL"/>
         </w:rPr>
         <w:t>שמירת סיסמאות</w:t>
       </w:r>
@@ -3879,6 +4336,8 @@
           <w:rFonts w:ascii="Arial" w:hAnsi="Arial" w:cs="Arial"/>
           <w:b w:val="0"/>
           <w:sz w:val="24"/>
+          <w:rtl w:val="1"/>
+          <w:lang w:bidi="he-IL"/>
         </w:rPr>
         <w:t>סיסמאות אינן נשמרות כטקסט גלוי. במקום זאת נשמר hash שנוצר באמצעות PBKDF2 עם salt אקראי. אם בסיס הנתונים נגנב, התוקף לא מקבל את הסיסמאות המקוריות באופן ישיר.</w:t>
       </w:r>
@@ -3895,6 +4354,8 @@
           <w:rFonts w:ascii="Arial" w:hAnsi="Arial" w:cs="Arial"/>
           <w:b/>
           <w:sz w:val="28"/>
+          <w:rtl w:val="1"/>
+          <w:lang w:bidi="he-IL"/>
         </w:rPr>
         <w:t>הגנה מפני SQL Injection</w:t>
       </w:r>
@@ -3910,6 +4371,8 @@
           <w:rFonts w:ascii="Arial" w:hAnsi="Arial" w:cs="Arial"/>
           <w:b w:val="0"/>
           <w:sz w:val="24"/>
+          <w:rtl w:val="1"/>
+          <w:lang w:bidi="he-IL"/>
         </w:rPr>
         <w:t>כל השאילתות משתמשות בפרמטרים. לדוגמה, במקום לחבר מחרוזת SQL עם קלט משתמש, הקוד מעביר את הערכים בנפרד ל-SQLite.</w:t>
       </w:r>
@@ -3926,6 +4389,8 @@
           <w:rFonts w:ascii="Arial" w:hAnsi="Arial" w:cs="Arial"/>
           <w:b/>
           <w:sz w:val="28"/>
+          <w:rtl w:val="1"/>
+          <w:lang w:bidi="he-IL"/>
         </w:rPr>
         <w:t>הגבלת גודל packets</w:t>
       </w:r>
@@ -3941,6 +4406,8 @@
           <w:rFonts w:ascii="Arial" w:hAnsi="Arial" w:cs="Arial"/>
           <w:b w:val="0"/>
           <w:sz w:val="24"/>
+          <w:rtl w:val="1"/>
+          <w:lang w:bidi="he-IL"/>
         </w:rPr>
         <w:t>הפרוטוקול מגביל את גודל ה-packet. כך נמנע מצב שבו משתמש שולח מידע ענק כדי לגרום לשרת לקרוס.</w:t>
       </w:r>
@@ -3957,6 +4424,8 @@
           <w:rFonts w:ascii="Arial" w:hAnsi="Arial" w:cs="Arial"/>
           <w:b/>
           <w:sz w:val="28"/>
+          <w:rtl w:val="1"/>
+          <w:lang w:bidi="he-IL"/>
         </w:rPr>
         <w:t>הגבלת גודל קבצים</w:t>
       </w:r>
@@ -3972,6 +4441,8 @@
           <w:rFonts w:ascii="Arial" w:hAnsi="Arial" w:cs="Arial"/>
           <w:b w:val="0"/>
           <w:sz w:val="24"/>
+          <w:rtl w:val="1"/>
+          <w:lang w:bidi="he-IL"/>
         </w:rPr>
         <w:t>המערכת מגבילה את גודל הקובץ שניתן לשלוח. פעולה זו מגינה מפני הצפת זיכרון ודיסק.</w:t>
       </w:r>
@@ -3988,6 +4459,8 @@
           <w:rFonts w:ascii="Arial" w:hAnsi="Arial" w:cs="Arial"/>
           <w:b/>
           <w:sz w:val="28"/>
+          <w:rtl w:val="1"/>
+          <w:lang w:bidi="he-IL"/>
         </w:rPr>
         <w:t>ניקוי שמות קבצים</w:t>
       </w:r>
@@ -4003,6 +4476,8 @@
           <w:rFonts w:ascii="Arial" w:hAnsi="Arial" w:cs="Arial"/>
           <w:b w:val="0"/>
           <w:sz w:val="24"/>
+          <w:rtl w:val="1"/>
+          <w:lang w:bidi="he-IL"/>
         </w:rPr>
         <w:t>המערכת מחליפה תווי נתיב מסוכנים בשם הקובץ. כך נמנעת כתיבה לתיקיות לא רצויות.</w:t>
       </w:r>
@@ -4019,6 +4494,8 @@
           <w:rFonts w:ascii="Arial" w:hAnsi="Arial" w:cs="Arial"/>
           <w:b/>
           <w:sz w:val="28"/>
+          <w:rtl w:val="1"/>
+          <w:lang w:bidi="he-IL"/>
         </w:rPr>
         <w:t>ניהול חריגות</w:t>
       </w:r>
@@ -4034,6 +4511,8 @@
           <w:rFonts w:ascii="Arial" w:hAnsi="Arial" w:cs="Arial"/>
           <w:b w:val="0"/>
           <w:sz w:val="24"/>
+          <w:rtl w:val="1"/>
+          <w:lang w:bidi="he-IL"/>
         </w:rPr>
         <w:t>בשרת יש שימוש ב-try/except כדי למנוע קריסה כאשר לקוח מתנתק או שולח מידע לא תקין.</w:t>
       </w:r>
@@ -4050,6 +4529,8 @@
           <w:rFonts w:ascii="Arial" w:hAnsi="Arial" w:cs="Arial"/>
           <w:b/>
           <w:sz w:val="28"/>
+          <w:rtl w:val="1"/>
+          <w:lang w:bidi="he-IL"/>
         </w:rPr>
         <w:t>חולשות שנותרו</w:t>
       </w:r>
@@ -4065,6 +4546,8 @@
           <w:rFonts w:ascii="Arial" w:hAnsi="Arial" w:cs="Arial"/>
           <w:b w:val="0"/>
           <w:sz w:val="24"/>
+          <w:rtl w:val="1"/>
+          <w:lang w:bidi="he-IL"/>
         </w:rPr>
         <w:t>1. תעודת TLS היא תעודת פיתוח מקומית ולא תעודה מסחרית מאומתת.</w:t>
       </w:r>
@@ -4079,6 +4562,8 @@
           <w:rFonts w:ascii="Arial" w:hAnsi="Arial" w:cs="Arial"/>
           <w:b w:val="0"/>
           <w:sz w:val="24"/>
+          <w:rtl w:val="1"/>
+          <w:lang w:bidi="he-IL"/>
         </w:rPr>
         <w:t>2. קוד 2FA הוא לימודי בלבד ולא נשלח לערוץ חיצוני.</w:t>
       </w:r>
@@ -4093,6 +4578,8 @@
           <w:rFonts w:ascii="Arial" w:hAnsi="Arial" w:cs="Arial"/>
           <w:b w:val="0"/>
           <w:sz w:val="24"/>
+          <w:rtl w:val="1"/>
+          <w:lang w:bidi="he-IL"/>
         </w:rPr>
         <w:t>3. אין מערכת הרשאות מלאה ברמת ארגון מסחרי.</w:t>
       </w:r>
@@ -4107,6 +4594,8 @@
           <w:rFonts w:ascii="Arial" w:hAnsi="Arial" w:cs="Arial"/>
           <w:b w:val="0"/>
           <w:sz w:val="24"/>
+          <w:rtl w:val="1"/>
+          <w:lang w:bidi="he-IL"/>
         </w:rPr>
         <w:t>4. אין סריקת אנטי-וירוס לקבצים שנשלחים.</w:t>
       </w:r>
@@ -4121,6 +4610,8 @@
           <w:rFonts w:ascii="Arial" w:hAnsi="Arial" w:cs="Arial"/>
           <w:b w:val="0"/>
           <w:sz w:val="24"/>
+          <w:rtl w:val="1"/>
+          <w:lang w:bidi="he-IL"/>
         </w:rPr>
         <w:t>5. אין הגבלת קצב התחברות מתקדמת נגד brute force.</w:t>
       </w:r>
@@ -4137,6 +4628,8 @@
           <w:rFonts w:ascii="Arial" w:hAnsi="Arial" w:cs="Arial"/>
           <w:b/>
           <w:sz w:val="28"/>
+          <w:rtl w:val="1"/>
+          <w:lang w:bidi="he-IL"/>
         </w:rPr>
         <w:t>שיפורים עתידיים באבטחה</w:t>
       </w:r>
@@ -4152,6 +4645,8 @@
           <w:rFonts w:ascii="Arial" w:hAnsi="Arial" w:cs="Arial"/>
           <w:b w:val="0"/>
           <w:sz w:val="24"/>
+          <w:rtl w:val="1"/>
+          <w:lang w:bidi="he-IL"/>
         </w:rPr>
         <w:t>1. שימוש בתעודת TLS חתומה על ידי CA.</w:t>
       </w:r>
@@ -4166,6 +4661,8 @@
           <w:rFonts w:ascii="Arial" w:hAnsi="Arial" w:cs="Arial"/>
           <w:b w:val="0"/>
           <w:sz w:val="24"/>
+          <w:rtl w:val="1"/>
+          <w:lang w:bidi="he-IL"/>
         </w:rPr>
         <w:t>2. הוספת rate limiting להתחברות.</w:t>
       </w:r>
@@ -4180,6 +4677,8 @@
           <w:rFonts w:ascii="Arial" w:hAnsi="Arial" w:cs="Arial"/>
           <w:b w:val="0"/>
           <w:sz w:val="24"/>
+          <w:rtl w:val="1"/>
+          <w:lang w:bidi="he-IL"/>
         </w:rPr>
         <w:t>3. הוספת אימות דו שלבי אמיתי באפליקציית Authenticator.</w:t>
       </w:r>
@@ -4194,6 +4693,8 @@
           <w:rFonts w:ascii="Arial" w:hAnsi="Arial" w:cs="Arial"/>
           <w:b w:val="0"/>
           <w:sz w:val="24"/>
+          <w:rtl w:val="1"/>
+          <w:lang w:bidi="he-IL"/>
         </w:rPr>
         <w:t>4. סריקת קבצים לפני פתיחה.</w:t>
       </w:r>
@@ -4208,6 +4709,8 @@
           <w:rFonts w:ascii="Arial" w:hAnsi="Arial" w:cs="Arial"/>
           <w:b w:val="0"/>
           <w:sz w:val="24"/>
+          <w:rtl w:val="1"/>
+          <w:lang w:bidi="he-IL"/>
         </w:rPr>
         <w:t>5. הרשאות מפורטות יותר לכל חדר.</w:t>
       </w:r>
@@ -4230,6 +4733,8 @@
           <w:rFonts w:ascii="Arial" w:hAnsi="Arial" w:cs="Arial"/>
           <w:b/>
           <w:sz w:val="32"/>
+          <w:rtl w:val="1"/>
+          <w:lang w:bidi="he-IL"/>
         </w:rPr>
         <w:t>11. תיאור מימוש הפרויקט</w:t>
       </w:r>
@@ -4246,6 +4751,8 @@
           <w:rFonts w:ascii="Arial" w:hAnsi="Arial" w:cs="Arial"/>
           <w:b/>
           <w:sz w:val="28"/>
+          <w:rtl w:val="1"/>
+          <w:lang w:bidi="he-IL"/>
         </w:rPr>
         <w:t>סביבת פיתוח</w:t>
       </w:r>
@@ -4261,6 +4768,8 @@
           <w:rFonts w:ascii="Arial" w:hAnsi="Arial" w:cs="Arial"/>
           <w:b w:val="0"/>
           <w:sz w:val="24"/>
+          <w:rtl w:val="1"/>
+          <w:lang w:bidi="he-IL"/>
         </w:rPr>
         <w:t>שפת תכנות: Python</w:t>
       </w:r>
@@ -4275,6 +4784,8 @@
           <w:rFonts w:ascii="Arial" w:hAnsi="Arial" w:cs="Arial"/>
           <w:b w:val="0"/>
           <w:sz w:val="24"/>
+          <w:rtl w:val="1"/>
+          <w:lang w:bidi="he-IL"/>
         </w:rPr>
         <w:t>ממשק משתמש: Tkinter</w:t>
       </w:r>
@@ -4289,6 +4800,8 @@
           <w:rFonts w:ascii="Arial" w:hAnsi="Arial" w:cs="Arial"/>
           <w:b w:val="0"/>
           <w:sz w:val="24"/>
+          <w:rtl w:val="1"/>
+          <w:lang w:bidi="he-IL"/>
         </w:rPr>
         <w:t>בסיס נתונים: SQLite</w:t>
       </w:r>
@@ -4303,6 +4816,8 @@
           <w:rFonts w:ascii="Arial" w:hAnsi="Arial" w:cs="Arial"/>
           <w:b w:val="0"/>
           <w:sz w:val="24"/>
+          <w:rtl w:val="1"/>
+          <w:lang w:bidi="he-IL"/>
         </w:rPr>
         <w:t>תקשורת: TCP sockets</w:t>
       </w:r>
@@ -4317,6 +4832,8 @@
           <w:rFonts w:ascii="Arial" w:hAnsi="Arial" w:cs="Arial"/>
           <w:b w:val="0"/>
           <w:sz w:val="24"/>
+          <w:rtl w:val="1"/>
+          <w:lang w:bidi="he-IL"/>
         </w:rPr>
         <w:t>הצפנה: TLS דרך ספריית ssl</w:t>
       </w:r>
@@ -4331,6 +4848,8 @@
           <w:rFonts w:ascii="Arial" w:hAnsi="Arial" w:cs="Arial"/>
           <w:b w:val="0"/>
           <w:sz w:val="24"/>
+          <w:rtl w:val="1"/>
+          <w:lang w:bidi="he-IL"/>
         </w:rPr>
         <w:t>ספרייה לתמונות: Pillow</w:t>
       </w:r>
@@ -4345,6 +4864,8 @@
           <w:rFonts w:ascii="Arial" w:hAnsi="Arial" w:cs="Arial"/>
           <w:b w:val="0"/>
           <w:sz w:val="24"/>
+          <w:rtl w:val="1"/>
+          <w:lang w:bidi="he-IL"/>
         </w:rPr>
         <w:t>ניהול גרסאות: Git ו-GitHub</w:t>
       </w:r>
@@ -4361,6 +4882,8 @@
           <w:rFonts w:ascii="Arial" w:hAnsi="Arial" w:cs="Arial"/>
           <w:b/>
           <w:sz w:val="28"/>
+          <w:rtl w:val="1"/>
+          <w:lang w:bidi="he-IL"/>
         </w:rPr>
         <w:t>הרצת השרת</w:t>
       </w:r>
@@ -4391,6 +4914,8 @@
           <w:rFonts w:ascii="Arial" w:hAnsi="Arial" w:cs="Arial"/>
           <w:b/>
           <w:sz w:val="28"/>
+          <w:rtl w:val="1"/>
+          <w:lang w:bidi="he-IL"/>
         </w:rPr>
         <w:t>הרצת לקוח</w:t>
       </w:r>
@@ -4421,6 +4946,8 @@
           <w:rFonts w:ascii="Arial" w:hAnsi="Arial" w:cs="Arial"/>
           <w:b/>
           <w:sz w:val="28"/>
+          <w:rtl w:val="1"/>
+          <w:lang w:bidi="he-IL"/>
         </w:rPr>
         <w:t>התקנת תלויות</w:t>
       </w:r>
@@ -4451,6 +4978,8 @@
           <w:rFonts w:ascii="Arial" w:hAnsi="Arial" w:cs="Arial"/>
           <w:b/>
           <w:sz w:val="28"/>
+          <w:rtl w:val="1"/>
+          <w:lang w:bidi="he-IL"/>
         </w:rPr>
         <w:t>מבנה תיקיות</w:t>
       </w:r>
@@ -4705,6 +5234,8 @@
           <w:rFonts w:ascii="Arial" w:hAnsi="Arial" w:cs="Arial"/>
           <w:b/>
           <w:sz w:val="32"/>
+          <w:rtl w:val="1"/>
+          <w:lang w:bidi="he-IL"/>
         </w:rPr>
         <w:t>12. תכנות מונחה עצמים</w:t>
       </w:r>
@@ -4720,6 +5251,8 @@
           <w:rFonts w:ascii="Arial" w:hAnsi="Arial" w:cs="Arial"/>
           <w:b w:val="0"/>
           <w:sz w:val="24"/>
+          <w:rtl w:val="1"/>
+          <w:lang w:bidi="he-IL"/>
         </w:rPr>
         <w:t>הפרויקט עומד בדרישת תכנות מונחה עצמים ומכיל הרבה יותר מארבע מחלקות.</w:t>
       </w:r>
@@ -4736,6 +5269,8 @@
           <w:rFonts w:ascii="Arial" w:hAnsi="Arial" w:cs="Arial"/>
           <w:b/>
           <w:sz w:val="28"/>
+          <w:rtl w:val="1"/>
+          <w:lang w:bidi="he-IL"/>
         </w:rPr>
         <w:t>מחלקות מרכזיות</w:t>
       </w:r>
@@ -4751,6 +5286,8 @@
           <w:rFonts w:ascii="Arial" w:hAnsi="Arial" w:cs="Arial"/>
           <w:b w:val="0"/>
           <w:sz w:val="24"/>
+          <w:rtl w:val="1"/>
+          <w:lang w:bidi="he-IL"/>
         </w:rPr>
         <w:t>1. ChatClientConnection</w:t>
       </w:r>
@@ -4765,6 +5302,8 @@
           <w:rFonts w:ascii="Arial" w:hAnsi="Arial" w:cs="Arial"/>
           <w:b w:val="0"/>
           <w:sz w:val="24"/>
+          <w:rtl w:val="1"/>
+          <w:lang w:bidi="he-IL"/>
         </w:rPr>
         <w:t xml:space="preserve">   אחראית על החיבור של הלקוח לשרת, שליחה וקבלה של packets.</w:t>
       </w:r>
@@ -4780,6 +5319,8 @@
           <w:rFonts w:ascii="Arial" w:hAnsi="Arial" w:cs="Arial"/>
           <w:b w:val="0"/>
           <w:sz w:val="24"/>
+          <w:rtl w:val="1"/>
+          <w:lang w:bidi="he-IL"/>
         </w:rPr>
         <w:t>2. SecureChatApp</w:t>
       </w:r>
@@ -4794,6 +5335,8 @@
           <w:rFonts w:ascii="Arial" w:hAnsi="Arial" w:cs="Arial"/>
           <w:b w:val="0"/>
           <w:sz w:val="24"/>
+          <w:rtl w:val="1"/>
+          <w:lang w:bidi="he-IL"/>
         </w:rPr>
         <w:t xml:space="preserve">   אחראית על הממשק הגרפי של הלקוח.</w:t>
       </w:r>
@@ -4809,6 +5352,8 @@
           <w:rFonts w:ascii="Arial" w:hAnsi="Arial" w:cs="Arial"/>
           <w:b w:val="0"/>
           <w:sz w:val="24"/>
+          <w:rtl w:val="1"/>
+          <w:lang w:bidi="he-IL"/>
         </w:rPr>
         <w:t>3. SecureChatServer</w:t>
       </w:r>
@@ -4823,6 +5368,8 @@
           <w:rFonts w:ascii="Arial" w:hAnsi="Arial" w:cs="Arial"/>
           <w:b w:val="0"/>
           <w:sz w:val="24"/>
+          <w:rtl w:val="1"/>
+          <w:lang w:bidi="he-IL"/>
         </w:rPr>
         <w:t xml:space="preserve">   אחראית על הפעלת השרת, ניהול לקוחות והפצת הודעות.</w:t>
       </w:r>
@@ -4838,6 +5385,8 @@
           <w:rFonts w:ascii="Arial" w:hAnsi="Arial" w:cs="Arial"/>
           <w:b w:val="0"/>
           <w:sz w:val="24"/>
+          <w:rtl w:val="1"/>
+          <w:lang w:bidi="he-IL"/>
         </w:rPr>
         <w:t>4. ClientHandler</w:t>
       </w:r>
@@ -4852,6 +5401,8 @@
           <w:rFonts w:ascii="Arial" w:hAnsi="Arial" w:cs="Arial"/>
           <w:b w:val="0"/>
           <w:sz w:val="24"/>
+          <w:rtl w:val="1"/>
+          <w:lang w:bidi="he-IL"/>
         </w:rPr>
         <w:t xml:space="preserve">   מייצגת לקוח יחיד בצד השרת ורצה בתוך Thread.</w:t>
       </w:r>
@@ -4867,6 +5418,8 @@
           <w:rFonts w:ascii="Arial" w:hAnsi="Arial" w:cs="Arial"/>
           <w:b w:val="0"/>
           <w:sz w:val="24"/>
+          <w:rtl w:val="1"/>
+          <w:lang w:bidi="he-IL"/>
         </w:rPr>
         <w:t>5. ChatProtocol</w:t>
       </w:r>
@@ -4881,6 +5434,8 @@
           <w:rFonts w:ascii="Arial" w:hAnsi="Arial" w:cs="Arial"/>
           <w:b w:val="0"/>
           <w:sz w:val="24"/>
+          <w:rtl w:val="1"/>
+          <w:lang w:bidi="he-IL"/>
         </w:rPr>
         <w:t xml:space="preserve">   אחראית על שליחה וקבלה של הודעות לפי הפרוטוקול.</w:t>
       </w:r>
@@ -4896,6 +5451,8 @@
           <w:rFonts w:ascii="Arial" w:hAnsi="Arial" w:cs="Arial"/>
           <w:b w:val="0"/>
           <w:sz w:val="24"/>
+          <w:rtl w:val="1"/>
+          <w:lang w:bidi="he-IL"/>
         </w:rPr>
         <w:t>6. ChatDatabase</w:t>
       </w:r>
@@ -4910,6 +5467,8 @@
           <w:rFonts w:ascii="Arial" w:hAnsi="Arial" w:cs="Arial"/>
           <w:b w:val="0"/>
           <w:sz w:val="24"/>
+          <w:rtl w:val="1"/>
+          <w:lang w:bidi="he-IL"/>
         </w:rPr>
         <w:t xml:space="preserve">   אחראית על כל הגישה לבסיס הנתונים.</w:t>
       </w:r>
@@ -4925,6 +5484,8 @@
           <w:rFonts w:ascii="Arial" w:hAnsi="Arial" w:cs="Arial"/>
           <w:b w:val="0"/>
           <w:sz w:val="24"/>
+          <w:rtl w:val="1"/>
+          <w:lang w:bidi="he-IL"/>
         </w:rPr>
         <w:t>7. PasswordHasher</w:t>
       </w:r>
@@ -4939,6 +5500,8 @@
           <w:rFonts w:ascii="Arial" w:hAnsi="Arial" w:cs="Arial"/>
           <w:b w:val="0"/>
           <w:sz w:val="24"/>
+          <w:rtl w:val="1"/>
+          <w:lang w:bidi="he-IL"/>
         </w:rPr>
         <w:t xml:space="preserve">   אחראית על hashing ואימות סיסמאות.</w:t>
       </w:r>
@@ -4954,6 +5517,8 @@
           <w:rFonts w:ascii="Arial" w:hAnsi="Arial" w:cs="Arial"/>
           <w:b w:val="0"/>
           <w:sz w:val="24"/>
+          <w:rtl w:val="1"/>
+          <w:lang w:bidi="he-IL"/>
         </w:rPr>
         <w:t>8. InputValidator</w:t>
       </w:r>
@@ -4968,6 +5533,8 @@
           <w:rFonts w:ascii="Arial" w:hAnsi="Arial" w:cs="Arial"/>
           <w:b w:val="0"/>
           <w:sz w:val="24"/>
+          <w:rtl w:val="1"/>
+          <w:lang w:bidi="he-IL"/>
         </w:rPr>
         <w:t xml:space="preserve">   אחראית על בדיקת קלטים.</w:t>
       </w:r>
@@ -4983,6 +5550,8 @@
           <w:rFonts w:ascii="Arial" w:hAnsi="Arial" w:cs="Arial"/>
           <w:b w:val="0"/>
           <w:sz w:val="24"/>
+          <w:rtl w:val="1"/>
+          <w:lang w:bidi="he-IL"/>
         </w:rPr>
         <w:t>9. TLSContextFactory</w:t>
       </w:r>
@@ -4997,6 +5566,8 @@
           <w:rFonts w:ascii="Arial" w:hAnsi="Arial" w:cs="Arial"/>
           <w:b w:val="0"/>
           <w:sz w:val="24"/>
+          <w:rtl w:val="1"/>
+          <w:lang w:bidi="he-IL"/>
         </w:rPr>
         <w:t xml:space="preserve">   אחראית על יצירת הקשרי TLS לשרת וללקוח.</w:t>
       </w:r>
@@ -5012,6 +5583,8 @@
           <w:rFonts w:ascii="Arial" w:hAnsi="Arial" w:cs="Arial"/>
           <w:b w:val="0"/>
           <w:sz w:val="24"/>
+          <w:rtl w:val="1"/>
+          <w:lang w:bidi="he-IL"/>
         </w:rPr>
         <w:t>10. ChatMessage, User, ClientInfo, ServerEvent</w:t>
       </w:r>
@@ -5026,6 +5599,8 @@
           <w:rFonts w:ascii="Arial" w:hAnsi="Arial" w:cs="Arial"/>
           <w:b w:val="0"/>
           <w:sz w:val="24"/>
+          <w:rtl w:val="1"/>
+          <w:lang w:bidi="he-IL"/>
         </w:rPr>
         <w:t xml:space="preserve">    מחלקות נתונים המתארות ישויות במערכת.</w:t>
       </w:r>
@@ -5042,6 +5617,8 @@
           <w:rFonts w:ascii="Arial" w:hAnsi="Arial" w:cs="Arial"/>
           <w:b/>
           <w:sz w:val="28"/>
+          <w:rtl w:val="1"/>
+          <w:lang w:bidi="he-IL"/>
         </w:rPr>
         <w:t>יתרונות החלוקה למחלקות</w:t>
       </w:r>
@@ -5057,6 +5634,8 @@
           <w:rFonts w:ascii="Arial" w:hAnsi="Arial" w:cs="Arial"/>
           <w:b w:val="0"/>
           <w:sz w:val="24"/>
+          <w:rtl w:val="1"/>
+          <w:lang w:bidi="he-IL"/>
         </w:rPr>
         <w:t>1. כל מחלקה אחראית על נושא ברור.</w:t>
       </w:r>
@@ -5071,6 +5650,8 @@
           <w:rFonts w:ascii="Arial" w:hAnsi="Arial" w:cs="Arial"/>
           <w:b w:val="0"/>
           <w:sz w:val="24"/>
+          <w:rtl w:val="1"/>
+          <w:lang w:bidi="he-IL"/>
         </w:rPr>
         <w:t>2. קל יותר לבדוק ולתחזק את הקוד.</w:t>
       </w:r>
@@ -5085,6 +5666,8 @@
           <w:rFonts w:ascii="Arial" w:hAnsi="Arial" w:cs="Arial"/>
           <w:b w:val="0"/>
           <w:sz w:val="24"/>
+          <w:rtl w:val="1"/>
+          <w:lang w:bidi="he-IL"/>
         </w:rPr>
         <w:t>3. השרת והלקוח מופרדים בצורה ברורה.</w:t>
       </w:r>
@@ -5099,6 +5682,8 @@
           <w:rFonts w:ascii="Arial" w:hAnsi="Arial" w:cs="Arial"/>
           <w:b w:val="0"/>
           <w:sz w:val="24"/>
+          <w:rtl w:val="1"/>
+          <w:lang w:bidi="he-IL"/>
         </w:rPr>
         <w:t>4. שכבת האבטחה מופרדת מה-GUI.</w:t>
       </w:r>
@@ -5113,6 +5698,8 @@
           <w:rFonts w:ascii="Arial" w:hAnsi="Arial" w:cs="Arial"/>
           <w:b w:val="0"/>
           <w:sz w:val="24"/>
+          <w:rtl w:val="1"/>
+          <w:lang w:bidi="he-IL"/>
         </w:rPr>
         <w:t>5. שכבת בסיס הנתונים מופרדת מלוגיקת התקשורת.</w:t>
       </w:r>
@@ -5135,6 +5722,8 @@
           <w:rFonts w:ascii="Arial" w:hAnsi="Arial" w:cs="Arial"/>
           <w:b/>
           <w:sz w:val="32"/>
+          <w:rtl w:val="1"/>
+          <w:lang w:bidi="he-IL"/>
         </w:rPr>
         <w:t>13. שמירת נתונים וקבצים</w:t>
       </w:r>
@@ -5151,6 +5740,8 @@
           <w:rFonts w:ascii="Arial" w:hAnsi="Arial" w:cs="Arial"/>
           <w:b/>
           <w:sz w:val="28"/>
+          <w:rtl w:val="1"/>
+          <w:lang w:bidi="he-IL"/>
         </w:rPr>
         <w:t>בסיס הנתונים</w:t>
       </w:r>
@@ -5166,6 +5757,8 @@
           <w:rFonts w:ascii="Arial" w:hAnsi="Arial" w:cs="Arial"/>
           <w:b w:val="0"/>
           <w:sz w:val="24"/>
+          <w:rtl w:val="1"/>
+          <w:lang w:bidi="he-IL"/>
         </w:rPr>
         <w:t>המערכת משתמשת בקובץ SQLite בשם secure_chat.db. בסיס הנתונים כולל מידע על:</w:t>
       </w:r>
@@ -5181,6 +5774,8 @@
           <w:rFonts w:ascii="Arial" w:hAnsi="Arial" w:cs="Arial"/>
           <w:b w:val="0"/>
           <w:sz w:val="24"/>
+          <w:rtl w:val="1"/>
+          <w:lang w:bidi="he-IL"/>
         </w:rPr>
         <w:t>1. משתמשים.</w:t>
       </w:r>
@@ -5195,6 +5790,8 @@
           <w:rFonts w:ascii="Arial" w:hAnsi="Arial" w:cs="Arial"/>
           <w:b w:val="0"/>
           <w:sz w:val="24"/>
+          <w:rtl w:val="1"/>
+          <w:lang w:bidi="he-IL"/>
         </w:rPr>
         <w:t>2. הודעות.</w:t>
       </w:r>
@@ -5209,6 +5806,8 @@
           <w:rFonts w:ascii="Arial" w:hAnsi="Arial" w:cs="Arial"/>
           <w:b w:val="0"/>
           <w:sz w:val="24"/>
+          <w:rtl w:val="1"/>
+          <w:lang w:bidi="he-IL"/>
         </w:rPr>
         <w:t>3. חדרים.</w:t>
       </w:r>
@@ -5223,6 +5822,8 @@
           <w:rFonts w:ascii="Arial" w:hAnsi="Arial" w:cs="Arial"/>
           <w:b w:val="0"/>
           <w:sz w:val="24"/>
+          <w:rtl w:val="1"/>
+          <w:lang w:bidi="he-IL"/>
         </w:rPr>
         <w:t>4. לוגים.</w:t>
       </w:r>
@@ -5237,6 +5838,8 @@
           <w:rFonts w:ascii="Arial" w:hAnsi="Arial" w:cs="Arial"/>
           <w:b w:val="0"/>
           <w:sz w:val="24"/>
+          <w:rtl w:val="1"/>
+          <w:lang w:bidi="he-IL"/>
         </w:rPr>
         <w:t>5. חברים.</w:t>
       </w:r>
@@ -5251,6 +5854,8 @@
           <w:rFonts w:ascii="Arial" w:hAnsi="Arial" w:cs="Arial"/>
           <w:b w:val="0"/>
           <w:sz w:val="24"/>
+          <w:rtl w:val="1"/>
+          <w:lang w:bidi="he-IL"/>
         </w:rPr>
         <w:t>6. הורדות.</w:t>
       </w:r>
@@ -5267,6 +5872,8 @@
           <w:rFonts w:ascii="Arial" w:hAnsi="Arial" w:cs="Arial"/>
           <w:b/>
           <w:sz w:val="28"/>
+          <w:rtl w:val="1"/>
+          <w:lang w:bidi="he-IL"/>
         </w:rPr>
         <w:t>שמירת קבצים</w:t>
       </w:r>
@@ -5282,6 +5889,8 @@
           <w:rFonts w:ascii="Arial" w:hAnsi="Arial" w:cs="Arial"/>
           <w:b w:val="0"/>
           <w:sz w:val="24"/>
+          <w:rtl w:val="1"/>
+          <w:lang w:bidi="he-IL"/>
         </w:rPr>
         <w:t>כאשר משתמש שולח קובץ, השרת שומר עותק בתיקיית data/uploads. הלקוח המקבל שומר את הקובץ בתיקיית downloads.</w:t>
       </w:r>
@@ -5298,6 +5907,8 @@
           <w:rFonts w:ascii="Arial" w:hAnsi="Arial" w:cs="Arial"/>
           <w:b/>
           <w:sz w:val="28"/>
+          <w:rtl w:val="1"/>
+          <w:lang w:bidi="he-IL"/>
         </w:rPr>
         <w:t>שמירת היסטוריית הודעות</w:t>
       </w:r>
@@ -5313,6 +5924,8 @@
           <w:rFonts w:ascii="Arial" w:hAnsi="Arial" w:cs="Arial"/>
           <w:b w:val="0"/>
           <w:sz w:val="24"/>
+          <w:rtl w:val="1"/>
+          <w:lang w:bidi="he-IL"/>
         </w:rPr>
         <w:t>הודעות נשמרות בטבלת messages. כאשר משתמש מצטרף לחדר, השרת שולח לו את ההודעות האחרונות של החדר.</w:t>
       </w:r>
@@ -5335,6 +5948,8 @@
           <w:rFonts w:ascii="Arial" w:hAnsi="Arial" w:cs="Arial"/>
           <w:b/>
           <w:sz w:val="32"/>
+          <w:rtl w:val="1"/>
+          <w:lang w:bidi="he-IL"/>
         </w:rPr>
         <w:t>14. בדיקות</w:t>
       </w:r>
@@ -5351,6 +5966,8 @@
           <w:rFonts w:ascii="Arial" w:hAnsi="Arial" w:cs="Arial"/>
           <w:b/>
           <w:sz w:val="28"/>
+          <w:rtl w:val="1"/>
+          <w:lang w:bidi="he-IL"/>
         </w:rPr>
         <w:t>בדיקה 1: הפעלת שרת</w:t>
       </w:r>
@@ -5366,6 +5983,8 @@
           <w:rFonts w:ascii="Arial" w:hAnsi="Arial" w:cs="Arial"/>
           <w:b w:val="0"/>
           <w:sz w:val="24"/>
+          <w:rtl w:val="1"/>
+          <w:lang w:bidi="he-IL"/>
         </w:rPr>
         <w:t>מטרה: לוודא שהשרת עולה ומאזין ל-port.</w:t>
       </w:r>
@@ -5380,6 +5999,8 @@
           <w:rFonts w:ascii="Arial" w:hAnsi="Arial" w:cs="Arial"/>
           <w:b w:val="0"/>
           <w:sz w:val="24"/>
+          <w:rtl w:val="1"/>
+          <w:lang w:bidi="he-IL"/>
         </w:rPr>
         <w:t>פעולה: להריץ python -m secure_chat.server.</w:t>
       </w:r>
@@ -5394,6 +6015,8 @@
           <w:rFonts w:ascii="Arial" w:hAnsi="Arial" w:cs="Arial"/>
           <w:b w:val="0"/>
           <w:sz w:val="24"/>
+          <w:rtl w:val="1"/>
+          <w:lang w:bidi="he-IL"/>
         </w:rPr>
         <w:t>תוצאה צפויה: מופיעה הודעה שהשרת מאזין לכתובת ול-port.</w:t>
       </w:r>
@@ -5408,6 +6031,8 @@
           <w:rFonts w:ascii="Arial" w:hAnsi="Arial" w:cs="Arial"/>
           <w:b w:val="0"/>
           <w:sz w:val="24"/>
+          <w:rtl w:val="1"/>
+          <w:lang w:bidi="he-IL"/>
         </w:rPr>
         <w:t>תוצאה בפועל: השרת עולה בהצלחה.</w:t>
       </w:r>
@@ -5424,6 +6049,8 @@
           <w:rFonts w:ascii="Arial" w:hAnsi="Arial" w:cs="Arial"/>
           <w:b/>
           <w:sz w:val="28"/>
+          <w:rtl w:val="1"/>
+          <w:lang w:bidi="he-IL"/>
         </w:rPr>
         <w:t>בדיקה 2: הרשמה</w:t>
       </w:r>
@@ -5439,6 +6066,8 @@
           <w:rFonts w:ascii="Arial" w:hAnsi="Arial" w:cs="Arial"/>
           <w:b w:val="0"/>
           <w:sz w:val="24"/>
+          <w:rtl w:val="1"/>
+          <w:lang w:bidi="he-IL"/>
         </w:rPr>
         <w:t>מטרה: לוודא שמשתמש חדש יכול להירשם.</w:t>
       </w:r>
@@ -5453,6 +6082,8 @@
           <w:rFonts w:ascii="Arial" w:hAnsi="Arial" w:cs="Arial"/>
           <w:b w:val="0"/>
           <w:sz w:val="24"/>
+          <w:rtl w:val="1"/>
+          <w:lang w:bidi="he-IL"/>
         </w:rPr>
         <w:t>פעולה: להפעיל לקוח, להזין שם משתמש וסיסמה וללחוץ Register.</w:t>
       </w:r>
@@ -5467,6 +6098,8 @@
           <w:rFonts w:ascii="Arial" w:hAnsi="Arial" w:cs="Arial"/>
           <w:b w:val="0"/>
           <w:sz w:val="24"/>
+          <w:rtl w:val="1"/>
+          <w:lang w:bidi="he-IL"/>
         </w:rPr>
         <w:t>תוצאה צפויה: הודעת הצלחה והתחברות למערכת.</w:t>
       </w:r>
@@ -5481,6 +6114,8 @@
           <w:rFonts w:ascii="Arial" w:hAnsi="Arial" w:cs="Arial"/>
           <w:b w:val="0"/>
           <w:sz w:val="24"/>
+          <w:rtl w:val="1"/>
+          <w:lang w:bidi="he-IL"/>
         </w:rPr>
         <w:t>תוצאה בפועל: המשתמש נרשם ונכנס למסך הצ'אט.</w:t>
       </w:r>
@@ -5497,6 +6132,8 @@
           <w:rFonts w:ascii="Arial" w:hAnsi="Arial" w:cs="Arial"/>
           <w:b/>
           <w:sz w:val="28"/>
+          <w:rtl w:val="1"/>
+          <w:lang w:bidi="he-IL"/>
         </w:rPr>
         <w:t>בדיקה 3: התחברות</w:t>
       </w:r>
@@ -5512,6 +6149,8 @@
           <w:rFonts w:ascii="Arial" w:hAnsi="Arial" w:cs="Arial"/>
           <w:b w:val="0"/>
           <w:sz w:val="24"/>
+          <w:rtl w:val="1"/>
+          <w:lang w:bidi="he-IL"/>
         </w:rPr>
         <w:t>מטרה: לוודא שמשתמש קיים יכול להתחבר.</w:t>
       </w:r>
@@ -5526,6 +6165,8 @@
           <w:rFonts w:ascii="Arial" w:hAnsi="Arial" w:cs="Arial"/>
           <w:b w:val="0"/>
           <w:sz w:val="24"/>
+          <w:rtl w:val="1"/>
+          <w:lang w:bidi="he-IL"/>
         </w:rPr>
         <w:t>פעולה: להזין שם משתמש וסיסמה קיימים וללחוץ Login.</w:t>
       </w:r>
@@ -5540,6 +6181,8 @@
           <w:rFonts w:ascii="Arial" w:hAnsi="Arial" w:cs="Arial"/>
           <w:b w:val="0"/>
           <w:sz w:val="24"/>
+          <w:rtl w:val="1"/>
+          <w:lang w:bidi="he-IL"/>
         </w:rPr>
         <w:t>תוצאה צפויה: מעבר למסך הצ'אט.</w:t>
       </w:r>
@@ -5554,6 +6197,8 @@
           <w:rFonts w:ascii="Arial" w:hAnsi="Arial" w:cs="Arial"/>
           <w:b w:val="0"/>
           <w:sz w:val="24"/>
+          <w:rtl w:val="1"/>
+          <w:lang w:bidi="he-IL"/>
         </w:rPr>
         <w:t>תוצאה בפועל: המשתמש מתחבר בהצלחה.</w:t>
       </w:r>
@@ -5570,6 +6215,8 @@
           <w:rFonts w:ascii="Arial" w:hAnsi="Arial" w:cs="Arial"/>
           <w:b/>
           <w:sz w:val="28"/>
+          <w:rtl w:val="1"/>
+          <w:lang w:bidi="he-IL"/>
         </w:rPr>
         <w:t>בדיקה 4: שם משתמש לא חוקי</w:t>
       </w:r>
@@ -5585,6 +6232,8 @@
           <w:rFonts w:ascii="Arial" w:hAnsi="Arial" w:cs="Arial"/>
           <w:b w:val="0"/>
           <w:sz w:val="24"/>
+          <w:rtl w:val="1"/>
+          <w:lang w:bidi="he-IL"/>
         </w:rPr>
         <w:t>מטרה: לבדוק טיפול בקלט לא תקין.</w:t>
       </w:r>
@@ -5599,6 +6248,8 @@
           <w:rFonts w:ascii="Arial" w:hAnsi="Arial" w:cs="Arial"/>
           <w:b w:val="0"/>
           <w:sz w:val="24"/>
+          <w:rtl w:val="1"/>
+          <w:lang w:bidi="he-IL"/>
         </w:rPr>
         <w:t>פעולה: להזין שם משתמש קצר מדי או עם תווים לא חוקיים.</w:t>
       </w:r>
@@ -5613,6 +6264,8 @@
           <w:rFonts w:ascii="Arial" w:hAnsi="Arial" w:cs="Arial"/>
           <w:b w:val="0"/>
           <w:sz w:val="24"/>
+          <w:rtl w:val="1"/>
+          <w:lang w:bidi="he-IL"/>
         </w:rPr>
         <w:t>תוצאה צפויה: הודעת שגיאה.</w:t>
       </w:r>
@@ -5627,6 +6280,8 @@
           <w:rFonts w:ascii="Arial" w:hAnsi="Arial" w:cs="Arial"/>
           <w:b w:val="0"/>
           <w:sz w:val="24"/>
+          <w:rtl w:val="1"/>
+          <w:lang w:bidi="he-IL"/>
         </w:rPr>
         <w:t>תוצאה בפועל: מוצגת הודעת שגיאה.</w:t>
       </w:r>
@@ -5643,6 +6298,8 @@
           <w:rFonts w:ascii="Arial" w:hAnsi="Arial" w:cs="Arial"/>
           <w:b/>
           <w:sz w:val="28"/>
+          <w:rtl w:val="1"/>
+          <w:lang w:bidi="he-IL"/>
         </w:rPr>
         <w:t>בדיקה 5: שני לקוחות באותו חדר</w:t>
       </w:r>
@@ -5658,6 +6315,8 @@
           <w:rFonts w:ascii="Arial" w:hAnsi="Arial" w:cs="Arial"/>
           <w:b w:val="0"/>
           <w:sz w:val="24"/>
+          <w:rtl w:val="1"/>
+          <w:lang w:bidi="he-IL"/>
         </w:rPr>
         <w:t>מטרה: לבדוק שרת מרובה לקוחות.</w:t>
       </w:r>
@@ -5672,6 +6331,8 @@
           <w:rFonts w:ascii="Arial" w:hAnsi="Arial" w:cs="Arial"/>
           <w:b w:val="0"/>
           <w:sz w:val="24"/>
+          <w:rtl w:val="1"/>
+          <w:lang w:bidi="he-IL"/>
         </w:rPr>
         <w:t>פעולה: לפתוח שני לקוחות, להתחבר בשני משתמשים ולשלוח הודעה.</w:t>
       </w:r>
@@ -5686,6 +6347,8 @@
           <w:rFonts w:ascii="Arial" w:hAnsi="Arial" w:cs="Arial"/>
           <w:b w:val="0"/>
           <w:sz w:val="24"/>
+          <w:rtl w:val="1"/>
+          <w:lang w:bidi="he-IL"/>
         </w:rPr>
         <w:t>תוצאה צפויה: ההודעה מופיעה אצל שני המשתמשים.</w:t>
       </w:r>
@@ -5700,6 +6363,8 @@
           <w:rFonts w:ascii="Arial" w:hAnsi="Arial" w:cs="Arial"/>
           <w:b w:val="0"/>
           <w:sz w:val="24"/>
+          <w:rtl w:val="1"/>
+          <w:lang w:bidi="he-IL"/>
         </w:rPr>
         <w:t>תוצאה בפועל: ההודעה עוברת בהצלחה.</w:t>
       </w:r>
@@ -5716,6 +6381,8 @@
           <w:rFonts w:ascii="Arial" w:hAnsi="Arial" w:cs="Arial"/>
           <w:b/>
           <w:sz w:val="28"/>
+          <w:rtl w:val="1"/>
+          <w:lang w:bidi="he-IL"/>
         </w:rPr>
         <w:t>בדיקה 6: יצירת חדר</w:t>
       </w:r>
@@ -5731,6 +6398,8 @@
           <w:rFonts w:ascii="Arial" w:hAnsi="Arial" w:cs="Arial"/>
           <w:b w:val="0"/>
           <w:sz w:val="24"/>
+          <w:rtl w:val="1"/>
+          <w:lang w:bidi="he-IL"/>
         </w:rPr>
         <w:t>מטרה: לבדוק יצירת חדר חדש.</w:t>
       </w:r>
@@ -5745,6 +6414,8 @@
           <w:rFonts w:ascii="Arial" w:hAnsi="Arial" w:cs="Arial"/>
           <w:b w:val="0"/>
           <w:sz w:val="24"/>
+          <w:rtl w:val="1"/>
+          <w:lang w:bidi="he-IL"/>
         </w:rPr>
         <w:t>פעולה: להזין שם חדר וללחוץ Create Room.</w:t>
       </w:r>
@@ -5759,6 +6430,8 @@
           <w:rFonts w:ascii="Arial" w:hAnsi="Arial" w:cs="Arial"/>
           <w:b w:val="0"/>
           <w:sz w:val="24"/>
+          <w:rtl w:val="1"/>
+          <w:lang w:bidi="he-IL"/>
         </w:rPr>
         <w:t>תוצאה צפויה: החדר מופיע ברשימת החדרים.</w:t>
       </w:r>
@@ -5773,6 +6446,8 @@
           <w:rFonts w:ascii="Arial" w:hAnsi="Arial" w:cs="Arial"/>
           <w:b w:val="0"/>
           <w:sz w:val="24"/>
+          <w:rtl w:val="1"/>
+          <w:lang w:bidi="he-IL"/>
         </w:rPr>
         <w:t>תוצאה בפועל: החדר נוצר ומופיע ברשימה.</w:t>
       </w:r>
@@ -5789,6 +6464,8 @@
           <w:rFonts w:ascii="Arial" w:hAnsi="Arial" w:cs="Arial"/>
           <w:b/>
           <w:sz w:val="28"/>
+          <w:rtl w:val="1"/>
+          <w:lang w:bidi="he-IL"/>
         </w:rPr>
         <w:t>בדיקה 7: חדר עם סיסמה</w:t>
       </w:r>
@@ -5804,6 +6481,8 @@
           <w:rFonts w:ascii="Arial" w:hAnsi="Arial" w:cs="Arial"/>
           <w:b w:val="0"/>
           <w:sz w:val="24"/>
+          <w:rtl w:val="1"/>
+          <w:lang w:bidi="he-IL"/>
         </w:rPr>
         <w:t>מטרה: לבדוק חדר מוגן בסיסמה.</w:t>
       </w:r>
@@ -5818,6 +6497,8 @@
           <w:rFonts w:ascii="Arial" w:hAnsi="Arial" w:cs="Arial"/>
           <w:b w:val="0"/>
           <w:sz w:val="24"/>
+          <w:rtl w:val="1"/>
+          <w:lang w:bidi="he-IL"/>
         </w:rPr>
         <w:t>פעולה: ליצור חדר בפורמט secret:1234 ולנסות להצטרף עם סיסמה נכונה ושגויה.</w:t>
       </w:r>
@@ -5832,6 +6513,8 @@
           <w:rFonts w:ascii="Arial" w:hAnsi="Arial" w:cs="Arial"/>
           <w:b w:val="0"/>
           <w:sz w:val="24"/>
+          <w:rtl w:val="1"/>
+          <w:lang w:bidi="he-IL"/>
         </w:rPr>
         <w:t>תוצאה צפויה: כניסה רק עם סיסמה נכונה.</w:t>
       </w:r>
@@ -5846,6 +6529,8 @@
           <w:rFonts w:ascii="Arial" w:hAnsi="Arial" w:cs="Arial"/>
           <w:b w:val="0"/>
           <w:sz w:val="24"/>
+          <w:rtl w:val="1"/>
+          <w:lang w:bidi="he-IL"/>
         </w:rPr>
         <w:t>תוצאה בפועל: המערכת בודקת את הסיסמה.</w:t>
       </w:r>
@@ -5862,6 +6547,8 @@
           <w:rFonts w:ascii="Arial" w:hAnsi="Arial" w:cs="Arial"/>
           <w:b/>
           <w:sz w:val="28"/>
+          <w:rtl w:val="1"/>
+          <w:lang w:bidi="he-IL"/>
         </w:rPr>
         <w:t>בדיקה 8: שליחת תמונה</w:t>
       </w:r>
@@ -5877,6 +6564,8 @@
           <w:rFonts w:ascii="Arial" w:hAnsi="Arial" w:cs="Arial"/>
           <w:b w:val="0"/>
           <w:sz w:val="24"/>
+          <w:rtl w:val="1"/>
+          <w:lang w:bidi="he-IL"/>
         </w:rPr>
         <w:t>מטרה: לוודא שתמונה נשלחת ומוצגת.</w:t>
       </w:r>
@@ -5891,6 +6580,8 @@
           <w:rFonts w:ascii="Arial" w:hAnsi="Arial" w:cs="Arial"/>
           <w:b w:val="0"/>
           <w:sz w:val="24"/>
+          <w:rtl w:val="1"/>
+          <w:lang w:bidi="he-IL"/>
         </w:rPr>
         <w:t>פעולה: ללחוץ Send Image ולבחור תמונה.</w:t>
       </w:r>
@@ -5905,6 +6596,8 @@
           <w:rFonts w:ascii="Arial" w:hAnsi="Arial" w:cs="Arial"/>
           <w:b w:val="0"/>
           <w:sz w:val="24"/>
+          <w:rtl w:val="1"/>
+          <w:lang w:bidi="he-IL"/>
         </w:rPr>
         <w:t>תוצאה צפויה: התמונה מופיעה בצ'אט כתצוגה מקדימה.</w:t>
       </w:r>
@@ -5919,6 +6612,8 @@
           <w:rFonts w:ascii="Arial" w:hAnsi="Arial" w:cs="Arial"/>
           <w:b w:val="0"/>
           <w:sz w:val="24"/>
+          <w:rtl w:val="1"/>
+          <w:lang w:bidi="he-IL"/>
         </w:rPr>
         <w:t>תוצאה בפועל: התמונה מוצגת ונשמרת בתיקיית downloads.</w:t>
       </w:r>
@@ -5935,6 +6630,8 @@
           <w:rFonts w:ascii="Arial" w:hAnsi="Arial" w:cs="Arial"/>
           <w:b/>
           <w:sz w:val="28"/>
+          <w:rtl w:val="1"/>
+          <w:lang w:bidi="he-IL"/>
         </w:rPr>
         <w:t>בדיקה 9: שליחת קובץ</w:t>
       </w:r>
@@ -5950,6 +6647,8 @@
           <w:rFonts w:ascii="Arial" w:hAnsi="Arial" w:cs="Arial"/>
           <w:b w:val="0"/>
           <w:sz w:val="24"/>
+          <w:rtl w:val="1"/>
+          <w:lang w:bidi="he-IL"/>
         </w:rPr>
         <w:t>מטרה: לוודא שקובץ נשלח ונפתח.</w:t>
       </w:r>
@@ -5964,6 +6663,8 @@
           <w:rFonts w:ascii="Arial" w:hAnsi="Arial" w:cs="Arial"/>
           <w:b w:val="0"/>
           <w:sz w:val="24"/>
+          <w:rtl w:val="1"/>
+          <w:lang w:bidi="he-IL"/>
         </w:rPr>
         <w:t>פעולה: ללחוץ Send File, לבחור קובץ וללחוץ על הקישור שהתקבל.</w:t>
       </w:r>
@@ -5978,6 +6679,8 @@
           <w:rFonts w:ascii="Arial" w:hAnsi="Arial" w:cs="Arial"/>
           <w:b w:val="0"/>
           <w:sz w:val="24"/>
+          <w:rtl w:val="1"/>
+          <w:lang w:bidi="he-IL"/>
         </w:rPr>
         <w:t>תוצאה צפויה: הקובץ נפתח בתוכנת ברירת המחדל.</w:t>
       </w:r>
@@ -5992,6 +6695,8 @@
           <w:rFonts w:ascii="Arial" w:hAnsi="Arial" w:cs="Arial"/>
           <w:b w:val="0"/>
           <w:sz w:val="24"/>
+          <w:rtl w:val="1"/>
+          <w:lang w:bidi="he-IL"/>
         </w:rPr>
         <w:t>תוצאה בפועל: הקובץ נפתח.</w:t>
       </w:r>
@@ -6008,6 +6713,8 @@
           <w:rFonts w:ascii="Arial" w:hAnsi="Arial" w:cs="Arial"/>
           <w:b/>
           <w:sz w:val="28"/>
+          <w:rtl w:val="1"/>
+          <w:lang w:bidi="he-IL"/>
         </w:rPr>
         <w:t>בדיקה 10: הודעה פרטית</w:t>
       </w:r>
@@ -6023,6 +6730,8 @@
           <w:rFonts w:ascii="Arial" w:hAnsi="Arial" w:cs="Arial"/>
           <w:b w:val="0"/>
           <w:sz w:val="24"/>
+          <w:rtl w:val="1"/>
+          <w:lang w:bidi="he-IL"/>
         </w:rPr>
         <w:t>מטרה: לבדוק פקודת DM.</w:t>
       </w:r>
@@ -6037,6 +6746,8 @@
           <w:rFonts w:ascii="Arial" w:hAnsi="Arial" w:cs="Arial"/>
           <w:b w:val="0"/>
           <w:sz w:val="24"/>
+          <w:rtl w:val="1"/>
+          <w:lang w:bidi="he-IL"/>
         </w:rPr>
         <w:t>פעולה: לשלוח /dm user hello.</w:t>
       </w:r>
@@ -6051,6 +6762,8 @@
           <w:rFonts w:ascii="Arial" w:hAnsi="Arial" w:cs="Arial"/>
           <w:b w:val="0"/>
           <w:sz w:val="24"/>
+          <w:rtl w:val="1"/>
+          <w:lang w:bidi="he-IL"/>
         </w:rPr>
         <w:t>תוצאה צפויה: ההודעה נשלחת כהודעה פרטית.</w:t>
       </w:r>
@@ -6065,6 +6778,8 @@
           <w:rFonts w:ascii="Arial" w:hAnsi="Arial" w:cs="Arial"/>
           <w:b w:val="0"/>
           <w:sz w:val="24"/>
+          <w:rtl w:val="1"/>
+          <w:lang w:bidi="he-IL"/>
         </w:rPr>
         <w:t>תוצאה בפועל: ההודעה מופיעה כהודעה פרטית.</w:t>
       </w:r>
@@ -6081,6 +6796,8 @@
           <w:rFonts w:ascii="Arial" w:hAnsi="Arial" w:cs="Arial"/>
           <w:b/>
           <w:sz w:val="28"/>
+          <w:rtl w:val="1"/>
+          <w:lang w:bidi="he-IL"/>
         </w:rPr>
         <w:t>בדיקה 11: חיפוש הודעות</w:t>
       </w:r>
@@ -6096,6 +6813,8 @@
           <w:rFonts w:ascii="Arial" w:hAnsi="Arial" w:cs="Arial"/>
           <w:b w:val="0"/>
           <w:sz w:val="24"/>
+          <w:rtl w:val="1"/>
+          <w:lang w:bidi="he-IL"/>
         </w:rPr>
         <w:t>מטרה: לבדוק חיפוש בהיסטוריית חדר.</w:t>
       </w:r>
@@ -6110,6 +6829,8 @@
           <w:rFonts w:ascii="Arial" w:hAnsi="Arial" w:cs="Arial"/>
           <w:b w:val="0"/>
           <w:sz w:val="24"/>
+          <w:rtl w:val="1"/>
+          <w:lang w:bidi="he-IL"/>
         </w:rPr>
         <w:t>פעולה: לשלוח /search word.</w:t>
       </w:r>
@@ -6124,6 +6845,8 @@
           <w:rFonts w:ascii="Arial" w:hAnsi="Arial" w:cs="Arial"/>
           <w:b w:val="0"/>
           <w:sz w:val="24"/>
+          <w:rtl w:val="1"/>
+          <w:lang w:bidi="he-IL"/>
         </w:rPr>
         <w:t>תוצאה צפויה: מתקבלת רשימת הודעות מתאימות.</w:t>
       </w:r>
@@ -6138,6 +6861,8 @@
           <w:rFonts w:ascii="Arial" w:hAnsi="Arial" w:cs="Arial"/>
           <w:b w:val="0"/>
           <w:sz w:val="24"/>
+          <w:rtl w:val="1"/>
+          <w:lang w:bidi="he-IL"/>
         </w:rPr>
         <w:t>תוצאה בפועל: המערכת מחזירה תוצאות.</w:t>
       </w:r>
@@ -6154,6 +6879,8 @@
           <w:rFonts w:ascii="Arial" w:hAnsi="Arial" w:cs="Arial"/>
           <w:b/>
           <w:sz w:val="28"/>
+          <w:rtl w:val="1"/>
+          <w:lang w:bidi="he-IL"/>
         </w:rPr>
         <w:t>בדיקה 12: פאנל מנהל</w:t>
       </w:r>
@@ -6169,6 +6896,8 @@
           <w:rFonts w:ascii="Arial" w:hAnsi="Arial" w:cs="Arial"/>
           <w:b w:val="0"/>
           <w:sz w:val="24"/>
+          <w:rtl w:val="1"/>
+          <w:lang w:bidi="he-IL"/>
         </w:rPr>
         <w:t>מטרה: לבדוק יכולות מנהל.</w:t>
       </w:r>
@@ -6183,6 +6912,8 @@
           <w:rFonts w:ascii="Arial" w:hAnsi="Arial" w:cs="Arial"/>
           <w:b w:val="0"/>
           <w:sz w:val="24"/>
+          <w:rtl w:val="1"/>
+          <w:lang w:bidi="he-IL"/>
         </w:rPr>
         <w:t>פעולה: להתחבר כמנהל ולשלוח /admin logs.</w:t>
       </w:r>
@@ -6197,6 +6928,8 @@
           <w:rFonts w:ascii="Arial" w:hAnsi="Arial" w:cs="Arial"/>
           <w:b w:val="0"/>
           <w:sz w:val="24"/>
+          <w:rtl w:val="1"/>
+          <w:lang w:bidi="he-IL"/>
         </w:rPr>
         <w:t>תוצאה צפויה: מוצגים לוגים.</w:t>
       </w:r>
@@ -6211,6 +6944,8 @@
           <w:rFonts w:ascii="Arial" w:hAnsi="Arial" w:cs="Arial"/>
           <w:b w:val="0"/>
           <w:sz w:val="24"/>
+          <w:rtl w:val="1"/>
+          <w:lang w:bidi="he-IL"/>
         </w:rPr>
         <w:t>תוצאה בפועל: לוגים מוצגים בצ'אט.</w:t>
       </w:r>
@@ -6233,6 +6968,8 @@
           <w:rFonts w:ascii="Arial" w:hAnsi="Arial" w:cs="Arial"/>
           <w:b/>
           <w:sz w:val="32"/>
+          <w:rtl w:val="1"/>
+          <w:lang w:bidi="he-IL"/>
         </w:rPr>
         <w:t>15. מדריך למשתמש</w:t>
       </w:r>
@@ -6249,6 +6986,8 @@
           <w:rFonts w:ascii="Arial" w:hAnsi="Arial" w:cs="Arial"/>
           <w:b/>
           <w:sz w:val="28"/>
+          <w:rtl w:val="1"/>
+          <w:lang w:bidi="he-IL"/>
         </w:rPr>
         <w:t>התחלת עבודה</w:t>
       </w:r>
@@ -6264,6 +7003,8 @@
           <w:rFonts w:ascii="Arial" w:hAnsi="Arial" w:cs="Arial"/>
           <w:b w:val="0"/>
           <w:sz w:val="24"/>
+          <w:rtl w:val="1"/>
+          <w:lang w:bidi="he-IL"/>
         </w:rPr>
         <w:t>1. התקן תלויות בעזרת pip install -r requirements.txt.</w:t>
       </w:r>
@@ -6278,6 +7019,8 @@
           <w:rFonts w:ascii="Arial" w:hAnsi="Arial" w:cs="Arial"/>
           <w:b w:val="0"/>
           <w:sz w:val="24"/>
+          <w:rtl w:val="1"/>
+          <w:lang w:bidi="he-IL"/>
         </w:rPr>
         <w:t>2. הפעל את השרת.</w:t>
       </w:r>
@@ -6292,6 +7035,8 @@
           <w:rFonts w:ascii="Arial" w:hAnsi="Arial" w:cs="Arial"/>
           <w:b w:val="0"/>
           <w:sz w:val="24"/>
+          <w:rtl w:val="1"/>
+          <w:lang w:bidi="he-IL"/>
         </w:rPr>
         <w:t>3. הפעל לקוח אחד או יותר.</w:t>
       </w:r>
@@ -6306,6 +7051,8 @@
           <w:rFonts w:ascii="Arial" w:hAnsi="Arial" w:cs="Arial"/>
           <w:b w:val="0"/>
           <w:sz w:val="24"/>
+          <w:rtl w:val="1"/>
+          <w:lang w:bidi="he-IL"/>
         </w:rPr>
         <w:t>4. הירשם עם שם משתמש וסיסמה.</w:t>
       </w:r>
@@ -6320,6 +7067,8 @@
           <w:rFonts w:ascii="Arial" w:hAnsi="Arial" w:cs="Arial"/>
           <w:b w:val="0"/>
           <w:sz w:val="24"/>
+          <w:rtl w:val="1"/>
+          <w:lang w:bidi="he-IL"/>
         </w:rPr>
         <w:t>5. לאחר הרשמה או התחברות תועבר למסך הצ'אט.</w:t>
       </w:r>
@@ -6336,6 +7085,8 @@
           <w:rFonts w:ascii="Arial" w:hAnsi="Arial" w:cs="Arial"/>
           <w:b/>
           <w:sz w:val="28"/>
+          <w:rtl w:val="1"/>
+          <w:lang w:bidi="he-IL"/>
         </w:rPr>
         <w:t>שימוש בצ'אט</w:t>
       </w:r>
@@ -6351,6 +7102,8 @@
           <w:rFonts w:ascii="Arial" w:hAnsi="Arial" w:cs="Arial"/>
           <w:b w:val="0"/>
           <w:sz w:val="24"/>
+          <w:rtl w:val="1"/>
+          <w:lang w:bidi="he-IL"/>
         </w:rPr>
         <w:t>1. כתוב הודעה בתיבת ההודעה.</w:t>
       </w:r>
@@ -6365,6 +7118,8 @@
           <w:rFonts w:ascii="Arial" w:hAnsi="Arial" w:cs="Arial"/>
           <w:b w:val="0"/>
           <w:sz w:val="24"/>
+          <w:rtl w:val="1"/>
+          <w:lang w:bidi="he-IL"/>
         </w:rPr>
         <w:t>2. לחץ Send או Enter.</w:t>
       </w:r>
@@ -6379,6 +7134,8 @@
           <w:rFonts w:ascii="Arial" w:hAnsi="Arial" w:cs="Arial"/>
           <w:b w:val="0"/>
           <w:sz w:val="24"/>
+          <w:rtl w:val="1"/>
+          <w:lang w:bidi="he-IL"/>
         </w:rPr>
         <w:t>3. להוספת אימוג'י לחץ על אחד מכפתורי האימוג'י.</w:t>
       </w:r>
@@ -6393,6 +7150,8 @@
           <w:rFonts w:ascii="Arial" w:hAnsi="Arial" w:cs="Arial"/>
           <w:b w:val="0"/>
           <w:sz w:val="24"/>
+          <w:rtl w:val="1"/>
+          <w:lang w:bidi="he-IL"/>
         </w:rPr>
         <w:t>4. לשליחת קובץ לחץ Send File.</w:t>
       </w:r>
@@ -6407,6 +7166,8 @@
           <w:rFonts w:ascii="Arial" w:hAnsi="Arial" w:cs="Arial"/>
           <w:b w:val="0"/>
           <w:sz w:val="24"/>
+          <w:rtl w:val="1"/>
+          <w:lang w:bidi="he-IL"/>
         </w:rPr>
         <w:t>5. לשליחת תמונה לחץ Send Image.</w:t>
       </w:r>
@@ -6421,6 +7182,8 @@
           <w:rFonts w:ascii="Arial" w:hAnsi="Arial" w:cs="Arial"/>
           <w:b w:val="0"/>
           <w:sz w:val="24"/>
+          <w:rtl w:val="1"/>
+          <w:lang w:bidi="he-IL"/>
         </w:rPr>
         <w:t>6. לשליחת סרטון לחץ Send Video.</w:t>
       </w:r>
@@ -6437,6 +7200,8 @@
           <w:rFonts w:ascii="Arial" w:hAnsi="Arial" w:cs="Arial"/>
           <w:b/>
           <w:sz w:val="28"/>
+          <w:rtl w:val="1"/>
+          <w:lang w:bidi="he-IL"/>
         </w:rPr>
         <w:t>שימוש בחדרים</w:t>
       </w:r>
@@ -6452,6 +7217,8 @@
           <w:rFonts w:ascii="Arial" w:hAnsi="Arial" w:cs="Arial"/>
           <w:b w:val="0"/>
           <w:sz w:val="24"/>
+          <w:rtl w:val="1"/>
+          <w:lang w:bidi="he-IL"/>
         </w:rPr>
         <w:t>1. בחר חדר מרשימת החדרים.</w:t>
       </w:r>
@@ -6466,6 +7233,8 @@
           <w:rFonts w:ascii="Arial" w:hAnsi="Arial" w:cs="Arial"/>
           <w:b w:val="0"/>
           <w:sz w:val="24"/>
+          <w:rtl w:val="1"/>
+          <w:lang w:bidi="he-IL"/>
         </w:rPr>
         <w:t>2. לחץ Join Selected.</w:t>
       </w:r>
@@ -6480,6 +7249,8 @@
           <w:rFonts w:ascii="Arial" w:hAnsi="Arial" w:cs="Arial"/>
           <w:b w:val="0"/>
           <w:sz w:val="24"/>
+          <w:rtl w:val="1"/>
+          <w:lang w:bidi="he-IL"/>
         </w:rPr>
         <w:t>3. ליצירת חדר חדש כתוב שם חדר ולחץ Create Room.</w:t>
       </w:r>
@@ -6494,6 +7265,8 @@
           <w:rFonts w:ascii="Arial" w:hAnsi="Arial" w:cs="Arial"/>
           <w:b w:val="0"/>
           <w:sz w:val="24"/>
+          <w:rtl w:val="1"/>
+          <w:lang w:bidi="he-IL"/>
         </w:rPr>
         <w:t>4. לחדר עם סיסמה כתוב room:password.</w:t>
       </w:r>
@@ -6510,6 +7283,8 @@
           <w:rFonts w:ascii="Arial" w:hAnsi="Arial" w:cs="Arial"/>
           <w:b/>
           <w:sz w:val="28"/>
+          <w:rtl w:val="1"/>
+          <w:lang w:bidi="he-IL"/>
         </w:rPr>
         <w:t>פקודות מתקדמות</w:t>
       </w:r>
@@ -6696,6 +7471,8 @@
           <w:rFonts w:ascii="Arial" w:hAnsi="Arial" w:cs="Arial"/>
           <w:b/>
           <w:sz w:val="28"/>
+          <w:rtl w:val="1"/>
+          <w:lang w:bidi="he-IL"/>
         </w:rPr>
         <w:t>צילומי מסך להוספה</w:t>
       </w:r>
@@ -6711,6 +7488,8 @@
           <w:rFonts w:ascii="Arial" w:hAnsi="Arial" w:cs="Arial"/>
           <w:b w:val="0"/>
           <w:sz w:val="24"/>
+          <w:rtl w:val="1"/>
+          <w:lang w:bidi="he-IL"/>
         </w:rPr>
         <w:t>יש להוסיף למסמך הסופי צילומי מסך של:</w:t>
       </w:r>
@@ -6726,6 +7505,8 @@
           <w:rFonts w:ascii="Arial" w:hAnsi="Arial" w:cs="Arial"/>
           <w:b w:val="0"/>
           <w:sz w:val="24"/>
+          <w:rtl w:val="1"/>
+          <w:lang w:bidi="he-IL"/>
         </w:rPr>
         <w:t>1. מסך הרשמה והתחברות.</w:t>
       </w:r>
@@ -6740,6 +7521,8 @@
           <w:rFonts w:ascii="Arial" w:hAnsi="Arial" w:cs="Arial"/>
           <w:b w:val="0"/>
           <w:sz w:val="24"/>
+          <w:rtl w:val="1"/>
+          <w:lang w:bidi="he-IL"/>
         </w:rPr>
         <w:t>2. מסך צ'אט לאחר התחברות.</w:t>
       </w:r>
@@ -6754,6 +7537,8 @@
           <w:rFonts w:ascii="Arial" w:hAnsi="Arial" w:cs="Arial"/>
           <w:b w:val="0"/>
           <w:sz w:val="24"/>
+          <w:rtl w:val="1"/>
+          <w:lang w:bidi="he-IL"/>
         </w:rPr>
         <w:t>3. שני לקוחות שמדברים באותו חדר.</w:t>
       </w:r>
@@ -6768,6 +7553,8 @@
           <w:rFonts w:ascii="Arial" w:hAnsi="Arial" w:cs="Arial"/>
           <w:b w:val="0"/>
           <w:sz w:val="24"/>
+          <w:rtl w:val="1"/>
+          <w:lang w:bidi="he-IL"/>
         </w:rPr>
         <w:t>4. שליחת תמונה והצגה בצ'אט.</w:t>
       </w:r>
@@ -6782,6 +7569,8 @@
           <w:rFonts w:ascii="Arial" w:hAnsi="Arial" w:cs="Arial"/>
           <w:b w:val="0"/>
           <w:sz w:val="24"/>
+          <w:rtl w:val="1"/>
+          <w:lang w:bidi="he-IL"/>
         </w:rPr>
         <w:t>5. שליחת קובץ וקישור לפתיחה.</w:t>
       </w:r>
@@ -6796,6 +7585,8 @@
           <w:rFonts w:ascii="Arial" w:hAnsi="Arial" w:cs="Arial"/>
           <w:b w:val="0"/>
           <w:sz w:val="24"/>
+          <w:rtl w:val="1"/>
+          <w:lang w:bidi="he-IL"/>
         </w:rPr>
         <w:t>6. רשימת חדרים.</w:t>
       </w:r>
@@ -6810,6 +7601,8 @@
           <w:rFonts w:ascii="Arial" w:hAnsi="Arial" w:cs="Arial"/>
           <w:b w:val="0"/>
           <w:sz w:val="24"/>
+          <w:rtl w:val="1"/>
+          <w:lang w:bidi="he-IL"/>
         </w:rPr>
         <w:t>7. פקודת /admin logs.</w:t>
       </w:r>
@@ -6832,6 +7625,8 @@
           <w:rFonts w:ascii="Arial" w:hAnsi="Arial" w:cs="Arial"/>
           <w:b/>
           <w:sz w:val="32"/>
+          <w:rtl w:val="1"/>
+          <w:lang w:bidi="he-IL"/>
         </w:rPr>
         <w:t>16. סיכום אישי ורפלקציה</w:t>
       </w:r>
@@ -6847,6 +7642,8 @@
           <w:rFonts w:ascii="Arial" w:hAnsi="Arial" w:cs="Arial"/>
           <w:b w:val="0"/>
           <w:sz w:val="24"/>
+          <w:rtl w:val="1"/>
+          <w:lang w:bidi="he-IL"/>
         </w:rPr>
         <w:t>במהלך העבודה על הפרויקט למדתי כיצד לבנות מערכת תקשורת אמיתית שמורכבת משרת ומלקוח. למדתי להשתמש בסוקטים, להבין כיצד מידע עובר ברשת, וכיצד שרת יכול לטפל בכמה לקוחות במקביל באמצעות Thread.</w:t>
       </w:r>
@@ -6862,6 +7659,8 @@
           <w:rFonts w:ascii="Arial" w:hAnsi="Arial" w:cs="Arial"/>
           <w:b w:val="0"/>
           <w:sz w:val="24"/>
+          <w:rtl w:val="1"/>
+          <w:lang w:bidi="he-IL"/>
         </w:rPr>
         <w:t>בנוסף למדתי על חשיבות אבטחת מידע. בתחילת הפרויקט היה קל לחשוב רק על שליחת הודעות, אבל בהמשך הבנתי שמערכת אמיתית חייבת להגן על סיסמאות, לבדוק קלטים, להצפין תעבורה ולמנוע קריסות.</w:t>
       </w:r>
@@ -6877,6 +7676,8 @@
           <w:rFonts w:ascii="Arial" w:hAnsi="Arial" w:cs="Arial"/>
           <w:b w:val="0"/>
           <w:sz w:val="24"/>
+          <w:rtl w:val="1"/>
+          <w:lang w:bidi="he-IL"/>
         </w:rPr>
         <w:t>למדתי גם על עבודה עם בסיס נתונים SQLite, שמירת משתמשים, הודעות, חדרים ולוגים. הבנתי את החשיבות של חלוקת הקוד למחלקות ומודולים, כי פרויקט גדול בקובץ אחד הופך מהר מאוד לקשה לתחזוקה.</w:t>
       </w:r>
@@ -6892,6 +7693,8 @@
           <w:rFonts w:ascii="Arial" w:hAnsi="Arial" w:cs="Arial"/>
           <w:b w:val="0"/>
           <w:sz w:val="24"/>
+          <w:rtl w:val="1"/>
+          <w:lang w:bidi="he-IL"/>
         </w:rPr>
         <w:t>החלק המאתגר ביותר היה שילוב כל הרכיבים ביחד: GUI, תקשורת, שרת מרובה לקוחות, הצפנה, בסיס נתונים וקבצים. כל שינוי בצד אחד השפיע על הצד השני, ולכן היה צורך לבדוק את המערכת בצורה מסודרת.</w:t>
       </w:r>
@@ -6907,6 +7710,8 @@
           <w:rFonts w:ascii="Arial" w:hAnsi="Arial" w:cs="Arial"/>
           <w:b w:val="0"/>
           <w:sz w:val="24"/>
+          <w:rtl w:val="1"/>
+          <w:lang w:bidi="he-IL"/>
         </w:rPr>
         <w:t>אם הייתי ממשיך לפתח את המערכת, הייתי מוסיף אפליקציית מובייל, אימות דו שלבי אמיתי, הרשאות מתקדמות יותר, עיצוב מודרני יותר וסריקת קבצים לפני פתיחה.</w:t>
       </w:r>
@@ -6929,6 +7734,8 @@
           <w:rFonts w:ascii="Arial" w:hAnsi="Arial" w:cs="Arial"/>
           <w:b/>
           <w:sz w:val="32"/>
+          <w:rtl w:val="1"/>
+          <w:lang w:bidi="he-IL"/>
         </w:rPr>
         <w:t>17. ביבליוגרפיה</w:t>
       </w:r>
@@ -6944,6 +7751,8 @@
           <w:rFonts w:ascii="Arial" w:hAnsi="Arial" w:cs="Arial"/>
           <w:b w:val="0"/>
           <w:sz w:val="24"/>
+          <w:rtl w:val="1"/>
+          <w:lang w:bidi="he-IL"/>
         </w:rPr>
         <w:t>1. Python Documentation - Socket Programming</w:t>
       </w:r>
@@ -6958,6 +7767,8 @@
           <w:rFonts w:ascii="Arial" w:hAnsi="Arial" w:cs="Arial"/>
           <w:b w:val="0"/>
           <w:sz w:val="24"/>
+          <w:rtl w:val="1"/>
+          <w:lang w:bidi="he-IL"/>
         </w:rPr>
         <w:t xml:space="preserve">   https://docs.python.org/3/library/socket.html</w:t>
       </w:r>
@@ -6973,6 +7784,8 @@
           <w:rFonts w:ascii="Arial" w:hAnsi="Arial" w:cs="Arial"/>
           <w:b w:val="0"/>
           <w:sz w:val="24"/>
+          <w:rtl w:val="1"/>
+          <w:lang w:bidi="he-IL"/>
         </w:rPr>
         <w:t>2. Python Documentation - ssl</w:t>
       </w:r>
@@ -6987,6 +7800,8 @@
           <w:rFonts w:ascii="Arial" w:hAnsi="Arial" w:cs="Arial"/>
           <w:b w:val="0"/>
           <w:sz w:val="24"/>
+          <w:rtl w:val="1"/>
+          <w:lang w:bidi="he-IL"/>
         </w:rPr>
         <w:t xml:space="preserve">   https://docs.python.org/3/library/ssl.html</w:t>
       </w:r>
@@ -7002,6 +7817,8 @@
           <w:rFonts w:ascii="Arial" w:hAnsi="Arial" w:cs="Arial"/>
           <w:b w:val="0"/>
           <w:sz w:val="24"/>
+          <w:rtl w:val="1"/>
+          <w:lang w:bidi="he-IL"/>
         </w:rPr>
         <w:t>3. Python Documentation - threading</w:t>
       </w:r>
@@ -7016,6 +7833,8 @@
           <w:rFonts w:ascii="Arial" w:hAnsi="Arial" w:cs="Arial"/>
           <w:b w:val="0"/>
           <w:sz w:val="24"/>
+          <w:rtl w:val="1"/>
+          <w:lang w:bidi="he-IL"/>
         </w:rPr>
         <w:t xml:space="preserve">   https://docs.python.org/3/library/threading.html</w:t>
       </w:r>
@@ -7031,6 +7850,8 @@
           <w:rFonts w:ascii="Arial" w:hAnsi="Arial" w:cs="Arial"/>
           <w:b w:val="0"/>
           <w:sz w:val="24"/>
+          <w:rtl w:val="1"/>
+          <w:lang w:bidi="he-IL"/>
         </w:rPr>
         <w:t>4. Python Documentation - sqlite3</w:t>
       </w:r>
@@ -7045,6 +7866,8 @@
           <w:rFonts w:ascii="Arial" w:hAnsi="Arial" w:cs="Arial"/>
           <w:b w:val="0"/>
           <w:sz w:val="24"/>
+          <w:rtl w:val="1"/>
+          <w:lang w:bidi="he-IL"/>
         </w:rPr>
         <w:t xml:space="preserve">   https://docs.python.org/3/library/sqlite3.html</w:t>
       </w:r>
@@ -7060,6 +7883,8 @@
           <w:rFonts w:ascii="Arial" w:hAnsi="Arial" w:cs="Arial"/>
           <w:b w:val="0"/>
           <w:sz w:val="24"/>
+          <w:rtl w:val="1"/>
+          <w:lang w:bidi="he-IL"/>
         </w:rPr>
         <w:t>5. Python Documentation - tkinter</w:t>
       </w:r>
@@ -7074,6 +7899,8 @@
           <w:rFonts w:ascii="Arial" w:hAnsi="Arial" w:cs="Arial"/>
           <w:b w:val="0"/>
           <w:sz w:val="24"/>
+          <w:rtl w:val="1"/>
+          <w:lang w:bidi="he-IL"/>
         </w:rPr>
         <w:t xml:space="preserve">   https://docs.python.org/3/library/tkinter.html</w:t>
       </w:r>
@@ -7089,6 +7916,8 @@
           <w:rFonts w:ascii="Arial" w:hAnsi="Arial" w:cs="Arial"/>
           <w:b w:val="0"/>
           <w:sz w:val="24"/>
+          <w:rtl w:val="1"/>
+          <w:lang w:bidi="he-IL"/>
         </w:rPr>
         <w:t>6. OWASP - Password Storage Cheat Sheet</w:t>
       </w:r>
@@ -7103,6 +7932,8 @@
           <w:rFonts w:ascii="Arial" w:hAnsi="Arial" w:cs="Arial"/>
           <w:b w:val="0"/>
           <w:sz w:val="24"/>
+          <w:rtl w:val="1"/>
+          <w:lang w:bidi="he-IL"/>
         </w:rPr>
         <w:t xml:space="preserve">   https://cheatsheetseries.owasp.org/cheatsheets/Password_Storage_Cheat_Sheet.html</w:t>
       </w:r>
@@ -7118,6 +7949,8 @@
           <w:rFonts w:ascii="Arial" w:hAnsi="Arial" w:cs="Arial"/>
           <w:b w:val="0"/>
           <w:sz w:val="24"/>
+          <w:rtl w:val="1"/>
+          <w:lang w:bidi="he-IL"/>
         </w:rPr>
         <w:t>7. OWASP - Transport Layer Protection</w:t>
       </w:r>
@@ -7132,6 +7965,8 @@
           <w:rFonts w:ascii="Arial" w:hAnsi="Arial" w:cs="Arial"/>
           <w:b w:val="0"/>
           <w:sz w:val="24"/>
+          <w:rtl w:val="1"/>
+          <w:lang w:bidi="he-IL"/>
         </w:rPr>
         <w:t xml:space="preserve">   https://owasp.org/www-project-top-ten/</w:t>
       </w:r>
@@ -7147,6 +7982,8 @@
           <w:rFonts w:ascii="Arial" w:hAnsi="Arial" w:cs="Arial"/>
           <w:b w:val="0"/>
           <w:sz w:val="24"/>
+          <w:rtl w:val="1"/>
+          <w:lang w:bidi="he-IL"/>
         </w:rPr>
         <w:t>8. SQLite Documentation</w:t>
       </w:r>
@@ -7161,6 +7998,8 @@
           <w:rFonts w:ascii="Arial" w:hAnsi="Arial" w:cs="Arial"/>
           <w:b w:val="0"/>
           <w:sz w:val="24"/>
+          <w:rtl w:val="1"/>
+          <w:lang w:bidi="he-IL"/>
         </w:rPr>
         <w:t xml:space="preserve">   https://www.sqlite.org/docs.html</w:t>
       </w:r>
@@ -7176,6 +8015,8 @@
           <w:rFonts w:ascii="Arial" w:hAnsi="Arial" w:cs="Arial"/>
           <w:b w:val="0"/>
           <w:sz w:val="24"/>
+          <w:rtl w:val="1"/>
+          <w:lang w:bidi="he-IL"/>
         </w:rPr>
         <w:t>9. Pillow Documentation</w:t>
       </w:r>
@@ -7190,6 +8031,8 @@
           <w:rFonts w:ascii="Arial" w:hAnsi="Arial" w:cs="Arial"/>
           <w:b w:val="0"/>
           <w:sz w:val="24"/>
+          <w:rtl w:val="1"/>
+          <w:lang w:bidi="he-IL"/>
         </w:rPr>
         <w:t xml:space="preserve">   https://pillow.readthedocs.io/</w:t>
       </w:r>
@@ -7212,6 +8055,8 @@
           <w:rFonts w:ascii="Arial" w:hAnsi="Arial" w:cs="Arial"/>
           <w:b/>
           <w:sz w:val="32"/>
+          <w:rtl w:val="1"/>
+          <w:lang w:bidi="he-IL"/>
         </w:rPr>
         <w:t>18. נספחים</w:t>
       </w:r>
@@ -7228,6 +8073,8 @@
           <w:rFonts w:ascii="Arial" w:hAnsi="Arial" w:cs="Arial"/>
           <w:b/>
           <w:sz w:val="28"/>
+          <w:rtl w:val="1"/>
+          <w:lang w:bidi="he-IL"/>
         </w:rPr>
         <w:t>נספח א: התאמה לדרישות החובה</w:t>
       </w:r>
@@ -7243,6 +8090,8 @@
           <w:rFonts w:ascii="Arial" w:hAnsi="Arial" w:cs="Arial"/>
           <w:b w:val="0"/>
           <w:sz w:val="24"/>
+          <w:rtl w:val="1"/>
+          <w:lang w:bidi="he-IL"/>
         </w:rPr>
         <w:t>1. תכנות מונחה עצמים</w:t>
       </w:r>
@@ -7257,6 +8106,8 @@
           <w:rFonts w:ascii="Arial" w:hAnsi="Arial" w:cs="Arial"/>
           <w:b w:val="0"/>
           <w:sz w:val="24"/>
+          <w:rtl w:val="1"/>
+          <w:lang w:bidi="he-IL"/>
         </w:rPr>
         <w:t xml:space="preserve">   קיימות מחלקות רבות: SecureChatApp, ChatClientConnection, SecureChatServer, ClientHandler, ChatProtocol, ChatDatabase, PasswordHasher, InputValidator ועוד.</w:t>
       </w:r>
@@ -7272,6 +8123,8 @@
           <w:rFonts w:ascii="Arial" w:hAnsi="Arial" w:cs="Arial"/>
           <w:b w:val="0"/>
           <w:sz w:val="24"/>
+          <w:rtl w:val="1"/>
+          <w:lang w:bidi="he-IL"/>
         </w:rPr>
         <w:t>2. תקשורת</w:t>
       </w:r>
@@ -7286,6 +8139,8 @@
           <w:rFonts w:ascii="Arial" w:hAnsi="Arial" w:cs="Arial"/>
           <w:b w:val="0"/>
           <w:sz w:val="24"/>
+          <w:rtl w:val="1"/>
+          <w:lang w:bidi="he-IL"/>
         </w:rPr>
         <w:t xml:space="preserve">   המערכת מממשת שרת ולקוח מבוססי sockets. השרת תומך במספר לקוחות במקביל.</w:t>
       </w:r>
@@ -7301,6 +8156,8 @@
           <w:rFonts w:ascii="Arial" w:hAnsi="Arial" w:cs="Arial"/>
           <w:b w:val="0"/>
           <w:sz w:val="24"/>
+          <w:rtl w:val="1"/>
+          <w:lang w:bidi="he-IL"/>
         </w:rPr>
         <w:t>3. פרוטוקול</w:t>
       </w:r>
@@ -7315,6 +8172,8 @@
           <w:rFonts w:ascii="Arial" w:hAnsi="Arial" w:cs="Arial"/>
           <w:b w:val="0"/>
           <w:sz w:val="24"/>
+          <w:rtl w:val="1"/>
+          <w:lang w:bidi="he-IL"/>
         </w:rPr>
         <w:t xml:space="preserve">   קיים פרוטוקול עצמאי המבוסס על JSON עם כותרת אורך של 4 בתים.</w:t>
       </w:r>
@@ -7330,6 +8189,8 @@
           <w:rFonts w:ascii="Arial" w:hAnsi="Arial" w:cs="Arial"/>
           <w:b w:val="0"/>
           <w:sz w:val="24"/>
+          <w:rtl w:val="1"/>
+          <w:lang w:bidi="he-IL"/>
         </w:rPr>
         <w:t>4. מערכת הפעלה</w:t>
       </w:r>
@@ -7344,6 +8205,8 @@
           <w:rFonts w:ascii="Arial" w:hAnsi="Arial" w:cs="Arial"/>
           <w:b w:val="0"/>
           <w:sz w:val="24"/>
+          <w:rtl w:val="1"/>
+          <w:lang w:bidi="he-IL"/>
         </w:rPr>
         <w:t xml:space="preserve">   המערכת משתמשת ב-Thread לכל לקוח, בגישה לקבצים, בתיקיות uploads/downloads ובבסיס נתונים קובצי.</w:t>
       </w:r>
@@ -7359,6 +8222,8 @@
           <w:rFonts w:ascii="Arial" w:hAnsi="Arial" w:cs="Arial"/>
           <w:b w:val="0"/>
           <w:sz w:val="24"/>
+          <w:rtl w:val="1"/>
+          <w:lang w:bidi="he-IL"/>
         </w:rPr>
         <w:t>5. אבטחה</w:t>
       </w:r>
@@ -7373,6 +8238,8 @@
           <w:rFonts w:ascii="Arial" w:hAnsi="Arial" w:cs="Arial"/>
           <w:b w:val="0"/>
           <w:sz w:val="24"/>
+          <w:rtl w:val="1"/>
+          <w:lang w:bidi="he-IL"/>
         </w:rPr>
         <w:t xml:space="preserve">   התקשורת מוצפנת ב-TLS, סיסמאות נשמרות כ-hash, ויש בדיקות קלט והגבלות גודל.</w:t>
       </w:r>
@@ -7388,6 +8255,8 @@
           <w:rFonts w:ascii="Arial" w:hAnsi="Arial" w:cs="Arial"/>
           <w:b w:val="0"/>
           <w:sz w:val="24"/>
+          <w:rtl w:val="1"/>
+          <w:lang w:bidi="he-IL"/>
         </w:rPr>
         <w:t>6. ממשק משתמש</w:t>
       </w:r>
@@ -7402,6 +8271,8 @@
           <w:rFonts w:ascii="Arial" w:hAnsi="Arial" w:cs="Arial"/>
           <w:b w:val="0"/>
           <w:sz w:val="24"/>
+          <w:rtl w:val="1"/>
+          <w:lang w:bidi="he-IL"/>
         </w:rPr>
         <w:t xml:space="preserve">   קיים GUI אינטראקטיבי עם מסך התחברות, צ'אט, חדרים, משתמשים, אימוג'ים, קבצים ותמונות.</w:t>
       </w:r>
@@ -7418,6 +8289,8 @@
           <w:rFonts w:ascii="Arial" w:hAnsi="Arial" w:cs="Arial"/>
           <w:b/>
           <w:sz w:val="28"/>
+          <w:rtl w:val="1"/>
+          <w:lang w:bidi="he-IL"/>
         </w:rPr>
         <w:t>נספח ב: פקודות הרצה</w:t>
       </w:r>
@@ -7474,6 +8347,8 @@
           <w:rFonts w:ascii="Arial" w:hAnsi="Arial" w:cs="Arial"/>
           <w:b/>
           <w:sz w:val="28"/>
+          <w:rtl w:val="1"/>
+          <w:lang w:bidi="he-IL"/>
         </w:rPr>
         <w:t>נספח ג: GitHub</w:t>
       </w:r>
@@ -7489,6 +8364,8 @@
           <w:rFonts w:ascii="Arial" w:hAnsi="Arial" w:cs="Arial"/>
           <w:b w:val="0"/>
           <w:sz w:val="24"/>
+          <w:rtl w:val="1"/>
+          <w:lang w:bidi="he-IL"/>
         </w:rPr>
         <w:t>כתובת הפרויקט:</w:t>
       </w:r>
@@ -7504,6 +8381,8 @@
           <w:rFonts w:ascii="Arial" w:hAnsi="Arial" w:cs="Arial"/>
           <w:b w:val="0"/>
           <w:sz w:val="24"/>
+          <w:rtl w:val="1"/>
+          <w:lang w:bidi="he-IL"/>
         </w:rPr>
         <w:t>https://github.com/iriszigdon/SecureChat</w:t>
       </w:r>
@@ -7520,6 +8399,8 @@
           <w:rFonts w:ascii="Arial" w:hAnsi="Arial" w:cs="Arial"/>
           <w:b/>
           <w:sz w:val="28"/>
+          <w:rtl w:val="1"/>
+          <w:lang w:bidi="he-IL"/>
         </w:rPr>
         <w:t>נספח ד: קבצים עיקריים</w:t>
       </w:r>
@@ -7535,6 +8416,8 @@
           <w:rFonts w:ascii="Arial" w:hAnsi="Arial" w:cs="Arial"/>
           <w:b w:val="0"/>
           <w:sz w:val="24"/>
+          <w:rtl w:val="1"/>
+          <w:lang w:bidi="he-IL"/>
         </w:rPr>
         <w:t>1. secure_chat/server.py - קוד השרת.</w:t>
       </w:r>
@@ -7549,6 +8432,8 @@
           <w:rFonts w:ascii="Arial" w:hAnsi="Arial" w:cs="Arial"/>
           <w:b w:val="0"/>
           <w:sz w:val="24"/>
+          <w:rtl w:val="1"/>
+          <w:lang w:bidi="he-IL"/>
         </w:rPr>
         <w:t>2. secure_chat/client_gui.py - קוד הלקוח הגרפי.</w:t>
       </w:r>
@@ -7563,6 +8448,8 @@
           <w:rFonts w:ascii="Arial" w:hAnsi="Arial" w:cs="Arial"/>
           <w:b w:val="0"/>
           <w:sz w:val="24"/>
+          <w:rtl w:val="1"/>
+          <w:lang w:bidi="he-IL"/>
         </w:rPr>
         <w:t>3. secure_chat/protocol.py - פרוטוקול התקשורת.</w:t>
       </w:r>
@@ -7577,6 +8464,8 @@
           <w:rFonts w:ascii="Arial" w:hAnsi="Arial" w:cs="Arial"/>
           <w:b w:val="0"/>
           <w:sz w:val="24"/>
+          <w:rtl w:val="1"/>
+          <w:lang w:bidi="he-IL"/>
         </w:rPr>
         <w:t>4. secure_chat/storage.py - בסיס הנתונים.</w:t>
       </w:r>
@@ -7591,6 +8480,8 @@
           <w:rFonts w:ascii="Arial" w:hAnsi="Arial" w:cs="Arial"/>
           <w:b w:val="0"/>
           <w:sz w:val="24"/>
+          <w:rtl w:val="1"/>
+          <w:lang w:bidi="he-IL"/>
         </w:rPr>
         <w:t>5. secure_chat/security.py - אבטחה ובדיקות קלט.</w:t>
       </w:r>
@@ -7605,6 +8496,8 @@
           <w:rFonts w:ascii="Arial" w:hAnsi="Arial" w:cs="Arial"/>
           <w:b w:val="0"/>
           <w:sz w:val="24"/>
+          <w:rtl w:val="1"/>
+          <w:lang w:bidi="he-IL"/>
         </w:rPr>
         <w:t>6. secure_chat/models.py - מחלקות נתונים.</w:t>
       </w:r>
@@ -7619,6 +8512,8 @@
           <w:rFonts w:ascii="Arial" w:hAnsi="Arial" w:cs="Arial"/>
           <w:b w:val="0"/>
           <w:sz w:val="24"/>
+          <w:rtl w:val="1"/>
+          <w:lang w:bidi="he-IL"/>
         </w:rPr>
         <w:t>7. README.md - הוראות הרצה.</w:t>
       </w:r>
@@ -7633,6 +8528,8 @@
           <w:rFonts w:ascii="Arial" w:hAnsi="Arial" w:cs="Arial"/>
           <w:b w:val="0"/>
           <w:sz w:val="24"/>
+          <w:rtl w:val="1"/>
+          <w:lang w:bidi="he-IL"/>
         </w:rPr>
         <w:t>8. CODE_REMARKS.md - הערות שורה אחר שורה לקוד.</w:t>
       </w:r>
@@ -7655,6 +8552,8 @@
           <w:rFonts w:ascii="Arial" w:hAnsi="Arial" w:cs="Arial"/>
           <w:b/>
           <w:sz w:val="32"/>
+          <w:rtl w:val="1"/>
+          <w:lang w:bidi="he-IL"/>
         </w:rPr>
         <w:t>הערה לסיום</w:t>
       </w:r>
@@ -7670,6 +8569,8 @@
           <w:rFonts w:ascii="Arial" w:hAnsi="Arial" w:cs="Arial"/>
           <w:b w:val="0"/>
           <w:sz w:val="24"/>
+          <w:rtl w:val="1"/>
+          <w:lang w:bidi="he-IL"/>
         </w:rPr>
         <w:t>ספר פרויקט זה נכתב בהתאם לדרישות פרויקט 5 יחידות בתחום מערכות הגנת סייבר: תכנון, מימוש, תקשורת, אבטחה, מערכת הפעלה, ממשק משתמש, בדיקות ותיעוד.</w:t>
       </w:r>
@@ -8087,6 +8988,9 @@
     <w:name w:val="Normal"/>
     <w:qFormat/>
     <w:rsid w:val="00FC693F"/>
+    <w:pPr>
+      <w:bidi w:val="1"/>
+    </w:pPr>
     <w:rPr>
       <w:rFonts w:ascii="Arial" w:hAnsi="Arial" w:cs="Arial"/>
     </w:rPr>
@@ -8148,6 +9052,7 @@
       <w:keepLines/>
       <w:spacing w:before="480" w:after="0"/>
       <w:outlineLvl w:val="0"/>
+      <w:bidi w:val="1"/>
     </w:pPr>
     <w:rPr>
       <w:rFonts w:asciiTheme="majorHAnsi" w:eastAsiaTheme="majorEastAsia" w:hAnsiTheme="majorHAnsi" w:cstheme="majorBidi" w:ascii="Arial" w:hAnsi="Arial" w:cs="Arial"/>
@@ -8172,6 +9077,7 @@
       <w:keepLines/>
       <w:spacing w:before="200" w:after="0"/>
       <w:outlineLvl w:val="1"/>
+      <w:bidi w:val="1"/>
     </w:pPr>
     <w:rPr>
       <w:rFonts w:asciiTheme="majorHAnsi" w:eastAsiaTheme="majorEastAsia" w:hAnsiTheme="majorHAnsi" w:cstheme="majorBidi" w:ascii="Arial" w:hAnsi="Arial" w:cs="Arial"/>
@@ -8196,6 +9102,7 @@
       <w:keepLines/>
       <w:spacing w:before="200" w:after="0"/>
       <w:outlineLvl w:val="2"/>
+      <w:bidi w:val="1"/>
     </w:pPr>
     <w:rPr>
       <w:rFonts w:asciiTheme="majorHAnsi" w:eastAsiaTheme="majorEastAsia" w:hAnsiTheme="majorHAnsi" w:cstheme="majorBidi" w:ascii="Arial" w:hAnsi="Arial" w:cs="Arial"/>
@@ -8437,6 +9344,7 @@
       </w:pBdr>
       <w:spacing w:after="300" w:line="240" w:lineRule="auto"/>
       <w:contextualSpacing/>
+      <w:bidi w:val="1"/>
     </w:pPr>
     <w:rPr>
       <w:rFonts w:asciiTheme="majorHAnsi" w:eastAsiaTheme="majorEastAsia" w:hAnsiTheme="majorHAnsi" w:cstheme="majorBidi" w:ascii="Arial" w:hAnsi="Arial" w:cs="Arial"/>

</xml_diff>